<commit_message>
stable version with correct changing of theme, but it need to write a method of theme changing on server
</commit_message>
<xml_diff>
--- a/БДПС.docx
+++ b/БДПС.docx
@@ -11736,6 +11736,7 @@
       <w:pPr>
         <w:pStyle w:val="a5"/>
       </w:pPr>
+      <w:bookmarkStart w:id="10" w:name="_Hlk198290962"/>
       <w:r>
         <w:t xml:space="preserve">Для проектирования модели </w:t>
       </w:r>
@@ -12238,7 +12239,7 @@
         </w:rPr>
         <w:t xml:space="preserve"> передачи данных, а именно </w:t>
       </w:r>
-      <w:bookmarkStart w:id="10" w:name="_Hlk193294772"/>
+      <w:bookmarkStart w:id="11" w:name="_Hlk193294772"/>
       <w:r>
         <w:rPr>
           <w:color w:val="000000"/>
@@ -12251,7 +12252,7 @@
         </w:rPr>
         <w:t xml:space="preserve"> </w:t>
       </w:r>
-      <w:bookmarkEnd w:id="10"/>
+      <w:bookmarkEnd w:id="11"/>
       <w:r>
         <w:rPr>
           <w:color w:val="000000"/>
@@ -12431,14 +12432,14 @@
         <w:rPr>
           <w:color w:val="000000"/>
         </w:rPr>
-        <w:t xml:space="preserve">Сервер обрабатывает запрос клиента, </w:t>
+        <w:t xml:space="preserve">Сервер обрабатывает запрос клиента, извлекая </w:t>
       </w:r>
       <w:r>
         <w:rPr>
           <w:color w:val="000000"/>
         </w:rPr>
         <w:lastRenderedPageBreak/>
-        <w:t>извлекая данные из базы данных.</w:t>
+        <w:t>данные из базы данных.</w:t>
       </w:r>
       <w:r>
         <w:rPr>
@@ -12858,33 +12859,33 @@
         <w:rPr>
           <w:color w:val="000000"/>
         </w:rPr>
+        <w:t>Важным моментом является хранение данных в базе на сервере, что обеспечивает возможность повторного доступа без необходимости повторного</w:t>
+      </w:r>
+      <w:r>
+        <w:rPr>
+          <w:color w:val="000000"/>
+        </w:rPr>
+        <w:t xml:space="preserve"> загрузки</w:t>
+      </w:r>
+      <w:r>
+        <w:rPr>
+          <w:color w:val="000000"/>
+        </w:rPr>
+        <w:t>.</w:t>
+      </w:r>
+    </w:p>
+    <w:p>
+      <w:pPr>
+        <w:pStyle w:val="a5"/>
+        <w:rPr>
+          <w:color w:val="000000"/>
+        </w:rPr>
+      </w:pPr>
+      <w:r>
+        <w:rPr>
+          <w:color w:val="000000"/>
+        </w:rPr>
         <w:lastRenderedPageBreak/>
-        <w:t>Важным моментом является хранение данных в базе на сервере, что обеспечивает возможность повторного доступа без необходимости повторного</w:t>
-      </w:r>
-      <w:r>
-        <w:rPr>
-          <w:color w:val="000000"/>
-        </w:rPr>
-        <w:t xml:space="preserve"> загрузки</w:t>
-      </w:r>
-      <w:r>
-        <w:rPr>
-          <w:color w:val="000000"/>
-        </w:rPr>
-        <w:t>.</w:t>
-      </w:r>
-    </w:p>
-    <w:p>
-      <w:pPr>
-        <w:pStyle w:val="a5"/>
-        <w:rPr>
-          <w:color w:val="000000"/>
-        </w:rPr>
-      </w:pPr>
-      <w:r>
-        <w:rPr>
-          <w:color w:val="000000"/>
-        </w:rPr>
         <w:t>Общая структура работы системы позволяет эффективно обновлять данные и предоставлять пользователю максимально актуальную информацию.</w:t>
       </w:r>
       <w:r>
@@ -13032,6 +13033,7 @@
       <w:pPr>
         <w:pStyle w:val="a5"/>
       </w:pPr>
+      <w:bookmarkStart w:id="12" w:name="_Hlk198290232"/>
       <w:r>
         <w:t>На рисунке</w:t>
       </w:r>
@@ -13181,13 +13183,15 @@
       <w:pPr>
         <w:pStyle w:val="230"/>
       </w:pPr>
-      <w:bookmarkStart w:id="11" w:name="_Toc193231716"/>
-      <w:bookmarkStart w:id="12" w:name="_Toc193271635"/>
+      <w:bookmarkStart w:id="13" w:name="_Toc193231716"/>
+      <w:bookmarkStart w:id="14" w:name="_Toc193271635"/>
+      <w:bookmarkEnd w:id="10"/>
+      <w:bookmarkEnd w:id="12"/>
       <w:r>
         <w:t>Требования к мобильному приложению</w:t>
       </w:r>
-      <w:bookmarkEnd w:id="11"/>
-      <w:bookmarkEnd w:id="12"/>
+      <w:bookmarkEnd w:id="13"/>
+      <w:bookmarkEnd w:id="14"/>
     </w:p>
     <w:p>
       <w:pPr>
@@ -13580,13 +13584,13 @@
       <w:pPr>
         <w:pStyle w:val="220"/>
       </w:pPr>
-      <w:bookmarkStart w:id="13" w:name="_Toc193231717"/>
-      <w:bookmarkStart w:id="14" w:name="_Toc193271636"/>
+      <w:bookmarkStart w:id="15" w:name="_Toc193231717"/>
+      <w:bookmarkStart w:id="16" w:name="_Toc193271636"/>
       <w:r>
         <w:t>Структура мобильного приложения</w:t>
       </w:r>
-      <w:bookmarkEnd w:id="13"/>
-      <w:bookmarkEnd w:id="14"/>
+      <w:bookmarkEnd w:id="15"/>
+      <w:bookmarkEnd w:id="16"/>
     </w:p>
     <w:p>
       <w:pPr>
@@ -13896,6 +13900,7 @@
       <w:pPr>
         <w:pStyle w:val="a5"/>
       </w:pPr>
+      <w:bookmarkStart w:id="17" w:name="_Hlk198290474"/>
       <w:r>
         <w:t xml:space="preserve">JSON (JavaScript Object </w:t>
       </w:r>
@@ -15742,20 +15747,22 @@
         <w:pStyle w:val="240"/>
         <w:ind w:firstLine="709"/>
       </w:pPr>
-      <w:bookmarkStart w:id="15" w:name="_Toc193231718"/>
-      <w:bookmarkStart w:id="16" w:name="_Toc193271637"/>
+      <w:bookmarkStart w:id="18" w:name="_Toc193231718"/>
+      <w:bookmarkStart w:id="19" w:name="_Toc193271637"/>
+      <w:bookmarkEnd w:id="17"/>
       <w:r>
         <w:t>Проектирование макета мобильного приложения</w:t>
       </w:r>
-      <w:bookmarkEnd w:id="15"/>
-      <w:bookmarkEnd w:id="16"/>
+      <w:bookmarkEnd w:id="18"/>
+      <w:bookmarkEnd w:id="19"/>
     </w:p>
     <w:p>
       <w:pPr>
         <w:pStyle w:val="330"/>
       </w:pPr>
-      <w:bookmarkStart w:id="17" w:name="_Toc193231719"/>
-      <w:bookmarkStart w:id="18" w:name="_Toc193271638"/>
+      <w:bookmarkStart w:id="20" w:name="_Toc193231719"/>
+      <w:bookmarkStart w:id="21" w:name="_Toc193271638"/>
+      <w:bookmarkStart w:id="22" w:name="_Hlk198287299"/>
       <w:r>
         <w:t>Экран загрузки (</w:t>
       </w:r>
@@ -15775,9 +15782,10 @@
       <w:r>
         <w:t>)</w:t>
       </w:r>
-      <w:bookmarkEnd w:id="17"/>
-      <w:bookmarkEnd w:id="18"/>
-    </w:p>
+      <w:bookmarkEnd w:id="20"/>
+      <w:bookmarkEnd w:id="21"/>
+    </w:p>
+    <w:bookmarkEnd w:id="22"/>
     <w:p>
       <w:pPr>
         <w:pStyle w:val="a5"/>
@@ -15817,11 +15825,11 @@
         <w:t xml:space="preserve"> – логотип приложения</w:t>
       </w:r>
       <w:r>
-        <w:t xml:space="preserve">. Это помогает сразу создать ассоциацию с футбольной тематикой приложения. Также под логотипом находится мотивационная фраза: «Будь в курсе, будь лидером». Данный экран не требует никакого взаимодействия от пользователя. Он появляется лишь на несколько секунд, пока загружается основное приложение. Цветовая гамма экрана выдержана в спортивном стиле, что подчеркивает его тематику. Логотипы партнеров находятся в нижней </w:t>
+        <w:t xml:space="preserve">. Это помогает сразу создать ассоциацию с футбольной тематикой приложения. Также под логотипом находится мотивационная фраза: «Будь в курсе, будь лидером». Данный экран не требует никакого взаимодействия от пользователя. Он появляется лишь на несколько секунд, пока загружается основное приложение. Цветовая гамма экрана выдержана в спортивном стиле, что подчеркивает его тематику. Логотипы партнеров находятся в нижней части </w:t>
       </w:r>
       <w:r>
         <w:lastRenderedPageBreak/>
-        <w:t xml:space="preserve">части экрана, но при этом они достаточно заметны. Отсутствие сложных анимаций делает загрузку быстрой и плавной. Это важно, так как пользователи не любят долгие ожидания. Используемые шрифты четкие и легко читаемые. Нет лишних деталей, которые могли бы отвлекать от основной информации. Экран выполнен в современном стиле, с акцентом на простоту и удобство. Визуально он передает динамику спорта и футбола. После завершения загрузки приложение автоматически переходит на следующий экран. Пользователю не нужно нажимать никаких кнопок. Весь экран направлен на создание первого положительного впечатления о приложении. Лаконичный дизайн помогает не перегружать внимание лишними элементами. Размер шрифта подобран таким образом, чтобы текст был читаемым даже на небольших экранах. Визуальная композиция сбалансирована, элементы размещены пропорционально. Основная цель экрана – мгновенно вовлечь пользователя в спортивную атмосферу. Белый фон делает приложение стильным и современным. В целом, экран загрузки является важной частью пользовательского </w:t>
+        <w:t xml:space="preserve">экрана, но при этом они достаточно заметны. Отсутствие сложных анимаций делает загрузку быстрой и плавной. Это важно, так как пользователи не любят долгие ожидания. Используемые шрифты четкие и легко читаемые. Нет лишних деталей, которые могли бы отвлекать от основной информации. Экран выполнен в современном стиле, с акцентом на простоту и удобство. Визуально он передает динамику спорта и футбола. После завершения загрузки приложение автоматически переходит на следующий экран. Пользователю не нужно нажимать никаких кнопок. Весь экран направлен на создание первого положительного впечатления о приложении. Лаконичный дизайн помогает не перегружать внимание лишними элементами. Размер шрифта подобран таким образом, чтобы текст был читаемым даже на небольших экранах. Визуальная композиция сбалансирована, элементы размещены пропорционально. Основная цель экрана – мгновенно вовлечь пользователя в спортивную атмосферу. Белый фон делает приложение стильным и современным. В целом, экран загрузки является важной частью пользовательского </w:t>
       </w:r>
       <w:r>
         <w:t>опыта. Он создает первое впечатление и задает тон всему приложению.</w:t>
@@ -15834,8 +15842,8 @@
           <w:lang w:val="en-US"/>
         </w:rPr>
       </w:pPr>
-      <w:bookmarkStart w:id="19" w:name="_Toc193231720"/>
-      <w:bookmarkStart w:id="20" w:name="_Toc193271639"/>
+      <w:bookmarkStart w:id="23" w:name="_Toc193231720"/>
+      <w:bookmarkStart w:id="24" w:name="_Toc193271639"/>
       <w:r>
         <w:t>Экран</w:t>
       </w:r>
@@ -15854,8 +15862,8 @@
         </w:rPr>
         <w:t xml:space="preserve"> (Log in screen)</w:t>
       </w:r>
-      <w:bookmarkEnd w:id="19"/>
-      <w:bookmarkEnd w:id="20"/>
+      <w:bookmarkEnd w:id="23"/>
+      <w:bookmarkEnd w:id="24"/>
     </w:p>
     <w:p>
       <w:pPr>
@@ -15882,8 +15890,8 @@
       <w:pPr>
         <w:pStyle w:val="32"/>
       </w:pPr>
-      <w:bookmarkStart w:id="21" w:name="_Toc193231721"/>
-      <w:bookmarkStart w:id="22" w:name="_Toc193271640"/>
+      <w:bookmarkStart w:id="25" w:name="_Toc193231721"/>
+      <w:bookmarkStart w:id="26" w:name="_Toc193271640"/>
       <w:r>
         <w:t>Экран регистрации (</w:t>
       </w:r>
@@ -15911,8 +15919,8 @@
       <w:r>
         <w:t>)</w:t>
       </w:r>
-      <w:bookmarkEnd w:id="21"/>
-      <w:bookmarkEnd w:id="22"/>
+      <w:bookmarkEnd w:id="25"/>
+      <w:bookmarkEnd w:id="26"/>
     </w:p>
     <w:p>
       <w:pPr>
@@ -15934,8 +15942,8 @@
       <w:pPr>
         <w:pStyle w:val="32"/>
       </w:pPr>
-      <w:bookmarkStart w:id="23" w:name="_Toc193231722"/>
-      <w:bookmarkStart w:id="24" w:name="_Toc193271641"/>
+      <w:bookmarkStart w:id="27" w:name="_Toc193231722"/>
+      <w:bookmarkStart w:id="28" w:name="_Toc193271641"/>
       <w:r>
         <w:t>Г</w:t>
       </w:r>
@@ -15950,8 +15958,8 @@
       <w:r>
         <w:t>)</w:t>
       </w:r>
-      <w:bookmarkEnd w:id="23"/>
-      <w:bookmarkEnd w:id="24"/>
+      <w:bookmarkEnd w:id="27"/>
+      <w:bookmarkEnd w:id="28"/>
     </w:p>
     <w:p>
       <w:pPr>
@@ -15983,8 +15991,8 @@
       <w:pPr>
         <w:pStyle w:val="32"/>
       </w:pPr>
-      <w:bookmarkStart w:id="25" w:name="_Toc193231723"/>
-      <w:bookmarkStart w:id="26" w:name="_Toc193271642"/>
+      <w:bookmarkStart w:id="29" w:name="_Toc193231723"/>
+      <w:bookmarkStart w:id="30" w:name="_Toc193271642"/>
       <w:r>
         <w:t xml:space="preserve">Экран профиля (Profile </w:t>
       </w:r>
@@ -15996,8 +16004,8 @@
       <w:r>
         <w:t>)</w:t>
       </w:r>
-      <w:bookmarkEnd w:id="25"/>
-      <w:bookmarkEnd w:id="26"/>
+      <w:bookmarkEnd w:id="29"/>
+      <w:bookmarkEnd w:id="30"/>
     </w:p>
     <w:p>
       <w:pPr>
@@ -16014,8 +16022,8 @@
       <w:pPr>
         <w:pStyle w:val="32"/>
       </w:pPr>
-      <w:bookmarkStart w:id="27" w:name="_Toc193231724"/>
-      <w:bookmarkStart w:id="28" w:name="_Toc193271643"/>
+      <w:bookmarkStart w:id="31" w:name="_Toc193231724"/>
+      <w:bookmarkStart w:id="32" w:name="_Toc193271643"/>
       <w:r>
         <w:lastRenderedPageBreak/>
         <w:t>Экран матчей (</w:t>
@@ -16036,82 +16044,6 @@
       <w:r>
         <w:t>)</w:t>
       </w:r>
-      <w:bookmarkEnd w:id="27"/>
-      <w:bookmarkEnd w:id="28"/>
-    </w:p>
-    <w:p>
-      <w:pPr>
-        <w:pStyle w:val="a5"/>
-      </w:pPr>
-      <w:r>
-        <w:t xml:space="preserve">Экран матчей отображает расписание предстоящих и прошедших футбольных игр. В верхней части экрана есть вкладки «Прошедшие» и «Предстоящие», позволяющие быстро переключаться между разделами. В каждой карточке матча указываются команды, дата и время игры, а также текущий статус. Для завершенных матчей дополнительно показывается счет. Дизайн карточек выполнен в строгом, но стильном формате с логотипами команд. Клик по карточке открывает подробную информацию о матче. Здесь пользователь может увидеть голы, карточки, замену игроков и другие события. Для предстоящих матчей возможен выбор напоминания. Если пользователь хочет следить за конкретной командой, он может добавить ее в избранное. Экран обновляется в реальном времени, чтобы отображать свежие результаты. Используется удобный фильтр для поиска матчей по лигам или командам. Навигация проста, все элементы располагаются логично. Цветовая гамма остается фирменной: белый фон, черный текст и красные акценты. Карточки матчей адаптированы для разных размеров экранов. Интерактивные элементы (например, кнопки «Добавить в избранное») интуитивно понятны. Внизу экрана можно увидеть сводку лучших игр текущей недели. Пользователь может включить </w:t>
-      </w:r>
-      <w:proofErr w:type="spellStart"/>
-      <w:r>
-        <w:t>push</w:t>
-      </w:r>
-      <w:proofErr w:type="spellEnd"/>
-      <w:r>
-        <w:t>-уведомления для интересующих его матчей. Благодаря этому он не пропустит важные события. В целом, экран матчей делает просмотр футбольного контента удобным и быстрым.</w:t>
-      </w:r>
-    </w:p>
-    <w:p>
-      <w:pPr>
-        <w:pStyle w:val="32"/>
-      </w:pPr>
-      <w:bookmarkStart w:id="29" w:name="_Toc193231725"/>
-      <w:bookmarkStart w:id="30" w:name="_Toc193271644"/>
-      <w:r>
-        <w:t>Экран статистики (</w:t>
-      </w:r>
-      <w:proofErr w:type="spellStart"/>
-      <w:r>
-        <w:t>Statistics</w:t>
-      </w:r>
-      <w:proofErr w:type="spellEnd"/>
-      <w:r>
-        <w:t xml:space="preserve"> </w:t>
-      </w:r>
-      <w:proofErr w:type="spellStart"/>
-      <w:r>
-        <w:t>Screen</w:t>
-      </w:r>
-      <w:proofErr w:type="spellEnd"/>
-      <w:r>
-        <w:t>)</w:t>
-      </w:r>
-      <w:bookmarkEnd w:id="29"/>
-      <w:bookmarkEnd w:id="30"/>
-    </w:p>
-    <w:p>
-      <w:pPr>
-        <w:pStyle w:val="a5"/>
-      </w:pPr>
-      <w:r>
-        <w:t xml:space="preserve">Этот экран предоставляет детализированную информацию о командах, игроках и матчах. В верхней части находятся фильтры, позволяющие выбирать турниры, клубы или игроков. Главный блок содержит общую статистику по чемпионату: количество голов, побед, поражений и ничьих. Далее идет раздел с индивидуальной статистикой лучших игроков: голеадоров, ассистентов и вратарей. Каждая карточка игрока содержит его фотографию, имя и текущий клуб. Клик по карточке открывает детальный профиль спортсмена. Здесь можно увидеть его возраст, рост, национальность и статистику за сезон. Данные обновляются в режиме реального времени. д. Визуальные графики помогают анализировать показатели команд и игроков. Интерактивные элементы позволяют быстро переключаться между различными разделами. Шрифт и цвета подобраны так, чтобы все данные были легко читаемыми. В разделе командной статистики можно сравнить несколько клубов между собой. Для каждого клуба есть информация о текущем месте в турнирной таблице. Используемые диаграммы и таблицы делают восприятие информации проще. Адаптивный дизайн обеспечивает удобное отображение на разных устройствах. Экран ориентирован как на </w:t>
-      </w:r>
-      <w:r>
-        <w:lastRenderedPageBreak/>
-        <w:t>обычных болельщиков, так и на более продвинутых аналитиков. В целом, этот раздел приложения полезен для всех, кто хочет глубже разбираться в футболе.</w:t>
-      </w:r>
-    </w:p>
-    <w:p>
-      <w:pPr>
-        <w:pStyle w:val="32"/>
-      </w:pPr>
-      <w:bookmarkStart w:id="31" w:name="_Toc193231726"/>
-      <w:bookmarkStart w:id="32" w:name="_Toc193271645"/>
-      <w:r>
-        <w:t xml:space="preserve">Экран новостей (News </w:t>
-      </w:r>
-      <w:proofErr w:type="spellStart"/>
-      <w:r>
-        <w:t>Screen</w:t>
-      </w:r>
-      <w:proofErr w:type="spellEnd"/>
-      <w:r>
-        <w:t>)</w:t>
-      </w:r>
       <w:bookmarkEnd w:id="31"/>
       <w:bookmarkEnd w:id="32"/>
     </w:p>
@@ -16120,7 +16052,7 @@
         <w:pStyle w:val="a5"/>
       </w:pPr>
       <w:r>
-        <w:t xml:space="preserve">Этот экран предоставляет пользователям свежие футбольные новости. В верхней части расположены категории: «Популярное», «Матчи», «Игроки», «Клубы». Основной контент представлен в виде карточек с изображениями и заголовками. Клик по карточке открывает полную статью. Тексты новостей адаптированы для мобильного просмотра. На экране предусмотрена лента с возможностью бесконечной прокрутки. Цветовая схема поддерживает фирменный стиль приложения. Каждая статья содержит дату публикации и источник информации. Возможна интеграция с </w:t>
+        <w:t xml:space="preserve">Экран матчей отображает расписание предстоящих и прошедших футбольных игр. В верхней части экрана есть вкладки «Прошедшие» и «Предстоящие», позволяющие быстро переключаться между разделами. В каждой карточке матча указываются команды, дата и время игры, а также текущий статус. Для завершенных матчей дополнительно показывается счет. Дизайн карточек выполнен в строгом, но стильном формате с логотипами команд. Клик по карточке открывает подробную информацию о матче. Здесь пользователь может увидеть голы, карточки, замену игроков и другие события. Для предстоящих матчей возможен выбор напоминания. Если пользователь хочет следить за конкретной командой, он может добавить ее в избранное. Экран обновляется в реальном времени, чтобы отображать свежие результаты. Используется удобный фильтр для поиска матчей по лигам или командам. Навигация проста, все элементы располагаются логично. Цветовая гамма остается фирменной: белый фон, черный текст и красные акценты. Карточки матчей адаптированы для разных размеров экранов. Интерактивные элементы (например, кнопки «Добавить в избранное») интуитивно понятны. Внизу экрана можно увидеть сводку лучших игр текущей недели. Пользователь может включить </w:t>
       </w:r>
       <w:proofErr w:type="spellStart"/>
       <w:r>
@@ -16128,27 +16060,21 @@
       </w:r>
       <w:proofErr w:type="spellEnd"/>
       <w:r>
-        <w:t xml:space="preserve">-уведомлениями, чтобы пользователи не пропускали важные события. Для удобства реализован поиск по ключевым словам. Карточки новостей отображают краткое описание статьи. Пользователь может сохранить интересные статьи в избранное. В разделе «Популярное» отображаются самые читаемые материалы за последние дни. Приложение может поддерживать комментарии под статьями. При долгом нажатии на новость возможен быстрый предпросмотр. Экран новостей обновляется в режиме реального времени. Возможна интеграция с </w:t>
-      </w:r>
-      <w:r>
-        <w:t>видеоматериалами</w:t>
-      </w:r>
-      <w:r>
-        <w:t>, например, интервью игроков. В целом, этот экран делает чтение новостей удобным и интересным.</w:t>
+        <w:t>-уведомления для интересующих его матчей. Благодаря этому он не пропустит важные события. В целом, экран матчей делает просмотр футбольного контента удобным и быстрым.</w:t>
       </w:r>
     </w:p>
     <w:p>
       <w:pPr>
         <w:pStyle w:val="32"/>
       </w:pPr>
-      <w:bookmarkStart w:id="33" w:name="_Toc193231727"/>
-      <w:bookmarkStart w:id="34" w:name="_Toc193271646"/>
-      <w:r>
-        <w:t>Экран настроек (</w:t>
-      </w:r>
-      <w:proofErr w:type="spellStart"/>
-      <w:r>
-        <w:t>Settings</w:t>
+      <w:bookmarkStart w:id="33" w:name="_Toc193231725"/>
+      <w:bookmarkStart w:id="34" w:name="_Toc193271644"/>
+      <w:r>
+        <w:t>Экран статистики (</w:t>
+      </w:r>
+      <w:proofErr w:type="spellStart"/>
+      <w:r>
+        <w:t>Statistics</w:t>
       </w:r>
       <w:proofErr w:type="spellEnd"/>
       <w:r>
@@ -16170,6 +16096,88 @@
         <w:pStyle w:val="a5"/>
       </w:pPr>
       <w:r>
+        <w:t xml:space="preserve">Этот экран предоставляет детализированную информацию о командах, игроках и матчах. В верхней части находятся фильтры, позволяющие выбирать турниры, клубы или игроков. Главный блок содержит общую статистику по чемпионату: количество голов, побед, поражений и ничьих. Далее идет раздел с индивидуальной статистикой лучших игроков: голеадоров, ассистентов и вратарей. Каждая карточка игрока содержит его фотографию, имя и текущий клуб. Клик по карточке открывает детальный профиль спортсмена. Здесь можно увидеть его возраст, рост, национальность и статистику за сезон. Данные обновляются в режиме реального времени. д. Визуальные графики помогают анализировать показатели команд и игроков. Интерактивные элементы позволяют быстро переключаться между различными разделами. Шрифт и цвета подобраны так, чтобы все данные были легко читаемыми. В разделе командной статистики можно сравнить несколько клубов между собой. Для каждого клуба есть информация о текущем месте в турнирной таблице. Используемые диаграммы и таблицы делают восприятие информации проще. Адаптивный дизайн обеспечивает удобное отображение на разных устройствах. Экран ориентирован как на обычных болельщиков, так и на более продвинутых </w:t>
+      </w:r>
+      <w:r>
+        <w:lastRenderedPageBreak/>
+        <w:t>аналитиков. В целом, этот раздел приложения полезен для всех, кто хочет глубже разбираться в футболе.</w:t>
+      </w:r>
+    </w:p>
+    <w:p>
+      <w:pPr>
+        <w:pStyle w:val="32"/>
+      </w:pPr>
+      <w:bookmarkStart w:id="35" w:name="_Toc193231726"/>
+      <w:bookmarkStart w:id="36" w:name="_Toc193271645"/>
+      <w:r>
+        <w:t xml:space="preserve">Экран новостей (News </w:t>
+      </w:r>
+      <w:proofErr w:type="spellStart"/>
+      <w:r>
+        <w:t>Screen</w:t>
+      </w:r>
+      <w:proofErr w:type="spellEnd"/>
+      <w:r>
+        <w:t>)</w:t>
+      </w:r>
+      <w:bookmarkEnd w:id="35"/>
+      <w:bookmarkEnd w:id="36"/>
+    </w:p>
+    <w:p>
+      <w:pPr>
+        <w:pStyle w:val="a5"/>
+      </w:pPr>
+      <w:r>
+        <w:t xml:space="preserve">Этот экран предоставляет пользователям свежие футбольные новости. В верхней части расположены категории: «Популярное», «Матчи», «Игроки», «Клубы». Основной контент представлен в виде карточек с изображениями и заголовками. Клик по карточке открывает полную статью. Тексты новостей адаптированы для мобильного просмотра. На экране предусмотрена лента с возможностью бесконечной прокрутки. Цветовая схема поддерживает фирменный стиль приложения. Каждая статья содержит дату публикации и источник информации. Возможна интеграция с </w:t>
+      </w:r>
+      <w:proofErr w:type="spellStart"/>
+      <w:r>
+        <w:t>push</w:t>
+      </w:r>
+      <w:proofErr w:type="spellEnd"/>
+      <w:r>
+        <w:t xml:space="preserve">-уведомлениями, чтобы пользователи не пропускали важные события. Для удобства реализован поиск по ключевым словам. Карточки новостей отображают краткое описание статьи. Пользователь может сохранить интересные статьи в избранное. В разделе «Популярное» отображаются самые читаемые материалы за последние дни. Приложение может поддерживать комментарии под статьями. При долгом нажатии на новость возможен быстрый предпросмотр. Экран новостей обновляется в режиме реального времени. Возможна интеграция с </w:t>
+      </w:r>
+      <w:r>
+        <w:t>видеоматериалами</w:t>
+      </w:r>
+      <w:r>
+        <w:t>, например, интервью игроков. В целом, этот экран делает чтение новостей удобным и интересным.</w:t>
+      </w:r>
+    </w:p>
+    <w:p>
+      <w:pPr>
+        <w:pStyle w:val="32"/>
+      </w:pPr>
+      <w:bookmarkStart w:id="37" w:name="_Toc193231727"/>
+      <w:bookmarkStart w:id="38" w:name="_Toc193271646"/>
+      <w:r>
+        <w:t>Экран настроек (</w:t>
+      </w:r>
+      <w:proofErr w:type="spellStart"/>
+      <w:r>
+        <w:t>Settings</w:t>
+      </w:r>
+      <w:proofErr w:type="spellEnd"/>
+      <w:r>
+        <w:t xml:space="preserve"> </w:t>
+      </w:r>
+      <w:proofErr w:type="spellStart"/>
+      <w:r>
+        <w:t>Screen</w:t>
+      </w:r>
+      <w:proofErr w:type="spellEnd"/>
+      <w:r>
+        <w:t>)</w:t>
+      </w:r>
+      <w:bookmarkEnd w:id="37"/>
+      <w:bookmarkEnd w:id="38"/>
+    </w:p>
+    <w:p>
+      <w:pPr>
+        <w:pStyle w:val="a5"/>
+      </w:pPr>
+      <w:r>
         <w:t>Экран настроек позволяет пользователю персонализировать приложение под себя. Здесь можно изменить язык интерфейса, включить или отключить уведомления и выбрать тему оформления. Визуальный стиль остается минималистичным. В разделе «Аккаунт» можно сменить пароль или выйти из системы. Приложение поддерживает темную и светлую тему. В разделе «Уведомления» можно настроить частоту получения новостей и матчевых оповещений. Доступен выбор любимых команд для персонализированного контента. В разделе «О приложении» содержится информация о разработчиках и версиях. Все элементы интерфейса сгруппированы для удобства навигации. Фирменная цветовая схема остается неизменной. Экран адаптирован для работы на разных устройствах. Доступна функция сброса настроек к стандартным параметрам. Возможен экспорт данных профиля. Приложение поддерживает биометрическую авторизацию. В целом, экран настроек помогает сделать приложение максимально удобным для пользователя.</w:t>
       </w:r>
     </w:p>
@@ -16177,355 +16185,12 @@
       <w:pPr>
         <w:pStyle w:val="230"/>
       </w:pPr>
-      <w:bookmarkStart w:id="35" w:name="_Toc193231728"/>
-      <w:bookmarkStart w:id="36" w:name="_Toc193271647"/>
+      <w:bookmarkStart w:id="39" w:name="_Toc193231728"/>
+      <w:bookmarkStart w:id="40" w:name="_Toc193271647"/>
       <w:r>
         <w:lastRenderedPageBreak/>
         <w:t>Защита и сохранность данных</w:t>
       </w:r>
-      <w:bookmarkEnd w:id="35"/>
-      <w:bookmarkEnd w:id="36"/>
-    </w:p>
-    <w:p>
-      <w:pPr>
-        <w:pStyle w:val="a5"/>
-      </w:pPr>
-      <w:r>
-        <w:t xml:space="preserve">В приложении </w:t>
-      </w:r>
-      <w:r>
-        <w:t>«</w:t>
-      </w:r>
-      <w:r>
-        <w:t>Спортивные Новости</w:t>
-      </w:r>
-      <w:r>
-        <w:t>»</w:t>
-      </w:r>
-      <w:r>
-        <w:t xml:space="preserve"> </w:t>
-      </w:r>
-      <w:r>
-        <w:t>особое внимание уделяется защите пользовательских данных и предотвращению несанкционированного доступа. Для этого реализуются несколько уровней безопасности, включая ограничение доступа, управление разрешениями и защиту от утечек информации.</w:t>
-      </w:r>
-    </w:p>
-    <w:p>
-      <w:pPr>
-        <w:pStyle w:val="a5"/>
-      </w:pPr>
-      <w:r>
-        <w:t>Ограничение доступа к данным</w:t>
-      </w:r>
-    </w:p>
-    <w:p>
-      <w:pPr>
-        <w:pStyle w:val="a5"/>
-      </w:pPr>
-      <w:r>
-        <w:t>Доступ к данным внутри приложения разграничивается в зависимости от типа информации и уровня прав пользователя.</w:t>
-      </w:r>
-      <w:r>
-        <w:t xml:space="preserve"> Так, например, л</w:t>
-      </w:r>
-      <w:r>
-        <w:t>ичные данные доступны только авторизованным пользователям</w:t>
-      </w:r>
-      <w:r>
-        <w:t>, а а</w:t>
-      </w:r>
-      <w:r>
-        <w:t>дминистративные функции (добавление новостей, редактирование контента) доступны только модераторам или администраторам в отде</w:t>
-      </w:r>
-      <w:r>
-        <w:t>л</w:t>
-      </w:r>
-      <w:r>
-        <w:t>ьном приложении для администраторов.</w:t>
-      </w:r>
-    </w:p>
-    <w:p>
-      <w:pPr>
-        <w:pStyle w:val="a5"/>
-      </w:pPr>
-      <w:r>
-        <w:t>Информация о матчах, новостях и видео открыта для всех пользователей, но без возможности модификации.</w:t>
-      </w:r>
-    </w:p>
-    <w:p>
-      <w:pPr>
-        <w:pStyle w:val="a5"/>
-      </w:pPr>
-      <w:r>
-        <w:t>Запросы к серверу проходят через защищенные API, исключая возможность получения конфиденциальных данных сторонними приложениями.</w:t>
-      </w:r>
-    </w:p>
-    <w:p>
-      <w:pPr>
-        <w:pStyle w:val="a5"/>
-      </w:pPr>
-      <w:r>
-        <w:t>Приложение требует минимальный набор разрешений, необходимых для его корректной работы:</w:t>
-      </w:r>
-    </w:p>
-    <w:p>
-      <w:pPr>
-        <w:pStyle w:val="a5"/>
-      </w:pPr>
-      <w:r>
-        <w:t>- д</w:t>
-      </w:r>
-      <w:r>
-        <w:t>оступ к интернету – требуется для загрузки новостей, матчей и видео</w:t>
-      </w:r>
-      <w:r>
-        <w:t>;</w:t>
-      </w:r>
-    </w:p>
-    <w:p>
-      <w:pPr>
-        <w:pStyle w:val="a5"/>
-      </w:pPr>
-      <w:r>
-        <w:t>- д</w:t>
-      </w:r>
-      <w:r>
-        <w:t xml:space="preserve">оступ к уведомлениям – используется для отправки </w:t>
-      </w:r>
-      <w:proofErr w:type="spellStart"/>
-      <w:r>
-        <w:t>push</w:t>
-      </w:r>
-      <w:proofErr w:type="spellEnd"/>
-      <w:r>
-        <w:t>-уведомлений о спортивных событиях</w:t>
-      </w:r>
-      <w:r>
-        <w:t>.</w:t>
-      </w:r>
-    </w:p>
-    <w:p>
-      <w:pPr>
-        <w:pStyle w:val="a5"/>
-      </w:pPr>
-      <w:r>
-        <w:t xml:space="preserve">При первом запуске приложение запрашивает только те разрешения, которые необходимы в данный момент. Пользователь может в любое время изменить настройки разрешений через системные параметры </w:t>
-      </w:r>
-      <w:proofErr w:type="spellStart"/>
-      <w:r>
-        <w:t>Android</w:t>
-      </w:r>
-      <w:proofErr w:type="spellEnd"/>
-      <w:r>
-        <w:t>.</w:t>
-      </w:r>
-    </w:p>
-    <w:p>
-      <w:pPr>
-        <w:pStyle w:val="a5"/>
-      </w:pPr>
-      <w:r>
-        <w:t>Защита информации от несанкционированного использования</w:t>
-      </w:r>
-    </w:p>
-    <w:p>
-      <w:pPr>
-        <w:pStyle w:val="a5"/>
-      </w:pPr>
-      <w:r>
-        <w:t>Для предотвращения утечки данных и несанкционированного доступа применяются следующие меры:</w:t>
-      </w:r>
-    </w:p>
-    <w:p>
-      <w:pPr>
-        <w:pStyle w:val="a5"/>
-      </w:pPr>
-      <w:r>
-        <w:t>- ш</w:t>
-      </w:r>
-      <w:r>
-        <w:t>ифрование данных – передача данных между клиентом и сервером осуществляется через защищенный протокол HTTPS</w:t>
-      </w:r>
-      <w:r>
-        <w:t>;</w:t>
-      </w:r>
-    </w:p>
-    <w:p>
-      <w:pPr>
-        <w:pStyle w:val="a5"/>
-      </w:pPr>
-      <w:r>
-        <w:t>- х</w:t>
-      </w:r>
-      <w:r>
-        <w:t xml:space="preserve">ранение данных в защищенной среде – </w:t>
-      </w:r>
-      <w:proofErr w:type="spellStart"/>
-      <w:r>
-        <w:t>SQLite</w:t>
-      </w:r>
-      <w:proofErr w:type="spellEnd"/>
-      <w:r>
-        <w:t>-база данных приложения хранится во внутреннем каталоге, недоступном для других приложений</w:t>
-      </w:r>
-      <w:r>
-        <w:t>;</w:t>
-      </w:r>
-    </w:p>
-    <w:p>
-      <w:pPr>
-        <w:pStyle w:val="a5"/>
-      </w:pPr>
-      <w:r>
-        <w:t>- л</w:t>
-      </w:r>
-      <w:r>
-        <w:t>ичные данные пользователей хранятся в зашифрованном виде на сервер</w:t>
-      </w:r>
-      <w:r>
-        <w:t>е.</w:t>
-      </w:r>
-    </w:p>
-    <w:p>
-      <w:pPr>
-        <w:pStyle w:val="230"/>
-      </w:pPr>
-      <w:bookmarkStart w:id="37" w:name="_Toc193231729"/>
-      <w:bookmarkStart w:id="38" w:name="_Toc193271648"/>
-      <w:r>
-        <w:t>Организация и ведение информационной базы (модели)</w:t>
-      </w:r>
-      <w:bookmarkEnd w:id="37"/>
-      <w:bookmarkEnd w:id="38"/>
-    </w:p>
-    <w:p>
-      <w:pPr>
-        <w:pStyle w:val="a5"/>
-      </w:pPr>
-      <w:r>
-        <w:t>Организация и ведение информационной базы</w:t>
-      </w:r>
-      <w:r>
-        <w:t xml:space="preserve"> приложения </w:t>
-      </w:r>
-      <w:r>
-        <w:t>«</w:t>
-      </w:r>
-      <w:r>
-        <w:t>Спортивные Новости</w:t>
-      </w:r>
-      <w:r>
-        <w:t>»</w:t>
-      </w:r>
-      <w:r>
-        <w:t xml:space="preserve"> </w:t>
-      </w:r>
-      <w:r>
-        <w:t xml:space="preserve">имеет сложную структуру, которая состоит из 3 </w:t>
-      </w:r>
-      <w:r>
-        <w:lastRenderedPageBreak/>
-        <w:t>систем управления базами данных (</w:t>
-      </w:r>
-      <w:r>
-        <w:rPr>
-          <w:lang w:val="en-US"/>
-        </w:rPr>
-        <w:t>SQL</w:t>
-      </w:r>
-      <w:r>
-        <w:t xml:space="preserve"> </w:t>
-      </w:r>
-      <w:r>
-        <w:rPr>
-          <w:lang w:val="en-US"/>
-        </w:rPr>
-        <w:t>server</w:t>
-      </w:r>
-      <w:r>
-        <w:t xml:space="preserve"> </w:t>
-      </w:r>
-      <w:r>
-        <w:t xml:space="preserve">для работы сервера, </w:t>
-      </w:r>
-      <w:proofErr w:type="spellStart"/>
-      <w:r>
-        <w:rPr>
-          <w:lang w:val="en-US"/>
-        </w:rPr>
-        <w:t>FireBase</w:t>
-      </w:r>
-      <w:proofErr w:type="spellEnd"/>
-      <w:r>
-        <w:t xml:space="preserve"> </w:t>
-      </w:r>
-      <w:r>
-        <w:t xml:space="preserve">хранения пользовательских данных и получения удобных сервисов от данной СУБД, а также </w:t>
-      </w:r>
-      <w:proofErr w:type="spellStart"/>
-      <w:r>
-        <w:rPr>
-          <w:lang w:val="en-US"/>
-        </w:rPr>
-        <w:t>SQl</w:t>
-      </w:r>
-      <w:proofErr w:type="spellEnd"/>
-      <w:r>
-        <w:t xml:space="preserve"> </w:t>
-      </w:r>
-      <w:r>
-        <w:rPr>
-          <w:lang w:val="en-US"/>
-        </w:rPr>
-        <w:t>lite</w:t>
-      </w:r>
-      <w:r>
-        <w:t xml:space="preserve"> </w:t>
-      </w:r>
-      <w:r>
-        <w:t xml:space="preserve">для организации хранения данных </w:t>
-      </w:r>
-      <w:r>
-        <w:t>локально</w:t>
-      </w:r>
-      <w:r>
-        <w:t xml:space="preserve">), несколько сторонних </w:t>
-      </w:r>
-      <w:r>
-        <w:rPr>
-          <w:lang w:val="en-US"/>
-        </w:rPr>
-        <w:t>API</w:t>
-      </w:r>
-      <w:r>
-        <w:t>, которые предоставляют данные</w:t>
-      </w:r>
-    </w:p>
-    <w:p>
-      <w:pPr>
-        <w:pStyle w:val="a5"/>
-      </w:pPr>
-      <w:r>
-        <w:t xml:space="preserve">База данных </w:t>
-      </w:r>
-      <w:r>
-        <w:t xml:space="preserve">«Спортивные новости» </w:t>
-      </w:r>
-      <w:r>
-        <w:t>на сервере</w:t>
-      </w:r>
-      <w:r>
-        <w:t xml:space="preserve"> предназначена для хранения и управления спортивными новостями и пользовательской информацией. Она состоит из нескольких взаимосвязанных таблиц, каждая из которых выполняет свою роль в обеспечении работы системы.</w:t>
-      </w:r>
-    </w:p>
-    <w:p>
-      <w:pPr>
-        <w:pStyle w:val="32"/>
-      </w:pPr>
-      <w:bookmarkStart w:id="39" w:name="_Toc193231730"/>
-      <w:bookmarkStart w:id="40" w:name="_Toc193271649"/>
-      <w:r>
-        <w:t>Таблица News</w:t>
-      </w:r>
       <w:bookmarkEnd w:id="39"/>
       <w:bookmarkEnd w:id="40"/>
     </w:p>
@@ -16534,7 +16199,22 @@
         <w:pStyle w:val="a5"/>
       </w:pPr>
       <w:r>
-        <w:t>Таблица News отвечает за хранение спортивных новостей. В ней содержатся ключевые поля:</w:t>
+        <w:t xml:space="preserve">В приложении </w:t>
+      </w:r>
+      <w:r>
+        <w:t>«</w:t>
+      </w:r>
+      <w:r>
+        <w:t>Спортивные Новости</w:t>
+      </w:r>
+      <w:r>
+        <w:t>»</w:t>
+      </w:r>
+      <w:r>
+        <w:t xml:space="preserve"> </w:t>
+      </w:r>
+      <w:r>
+        <w:t>особое внимание уделяется защите пользовательских данных и предотвращению несанкционированного доступа. Для этого реализуются несколько уровней безопасности, включая ограничение доступа, управление разрешениями и защиту от утечек информации.</w:t>
       </w:r>
     </w:p>
     <w:p>
@@ -16542,10 +16222,68 @@
         <w:pStyle w:val="a5"/>
       </w:pPr>
       <w:r>
-        <w:t xml:space="preserve">- </w:t>
-      </w:r>
-      <w:r>
-        <w:t>Sport — вид спорта, к которому относится новость (например, футбол, баскетбол)</w:t>
+        <w:t>Ограничение доступа к данным</w:t>
+      </w:r>
+    </w:p>
+    <w:p>
+      <w:pPr>
+        <w:pStyle w:val="a5"/>
+      </w:pPr>
+      <w:r>
+        <w:t>Доступ к данным внутри приложения разграничивается в зависимости от типа информации и уровня прав пользователя.</w:t>
+      </w:r>
+      <w:r>
+        <w:t xml:space="preserve"> Так, например, л</w:t>
+      </w:r>
+      <w:r>
+        <w:t>ичные данные доступны только авторизованным пользователям</w:t>
+      </w:r>
+      <w:r>
+        <w:t>, а а</w:t>
+      </w:r>
+      <w:r>
+        <w:t>дминистративные функции (добавление новостей, редактирование контента) доступны только модераторам или администраторам в отде</w:t>
+      </w:r>
+      <w:r>
+        <w:t>л</w:t>
+      </w:r>
+      <w:r>
+        <w:t>ьном приложении для администраторов.</w:t>
+      </w:r>
+    </w:p>
+    <w:p>
+      <w:pPr>
+        <w:pStyle w:val="a5"/>
+      </w:pPr>
+      <w:r>
+        <w:t>Информация о матчах, новостях и видео открыта для всех пользователей, но без возможности модификации.</w:t>
+      </w:r>
+    </w:p>
+    <w:p>
+      <w:pPr>
+        <w:pStyle w:val="a5"/>
+      </w:pPr>
+      <w:r>
+        <w:t>Запросы к серверу проходят через защищенные API, исключая возможность получения конфиденциальных данных сторонними приложениями.</w:t>
+      </w:r>
+    </w:p>
+    <w:p>
+      <w:pPr>
+        <w:pStyle w:val="a5"/>
+      </w:pPr>
+      <w:r>
+        <w:t>Приложение требует минимальный набор разрешений, необходимых для его корректной работы:</w:t>
+      </w:r>
+    </w:p>
+    <w:p>
+      <w:pPr>
+        <w:pStyle w:val="a5"/>
+      </w:pPr>
+      <w:r>
+        <w:t>- д</w:t>
+      </w:r>
+      <w:r>
+        <w:t>оступ к интернету – требуется для загрузки новостей, матчей и видео</w:t>
       </w:r>
       <w:r>
         <w:t>;</w:t>
@@ -16556,15 +16294,64 @@
         <w:pStyle w:val="a5"/>
       </w:pPr>
       <w:r>
-        <w:t xml:space="preserve">- </w:t>
-      </w:r>
-      <w:proofErr w:type="spellStart"/>
-      <w:r>
-        <w:t>DateTime</w:t>
-      </w:r>
-      <w:proofErr w:type="spellEnd"/>
-      <w:r>
-        <w:t xml:space="preserve"> — дата и время публикации новости (используется как первичный ключ)</w:t>
+        <w:t>- д</w:t>
+      </w:r>
+      <w:r>
+        <w:t xml:space="preserve">оступ к уведомлениям – используется для отправки </w:t>
+      </w:r>
+      <w:proofErr w:type="spellStart"/>
+      <w:r>
+        <w:t>push</w:t>
+      </w:r>
+      <w:proofErr w:type="spellEnd"/>
+      <w:r>
+        <w:t>-уведомлений о спортивных событиях</w:t>
+      </w:r>
+      <w:r>
+        <w:t>.</w:t>
+      </w:r>
+    </w:p>
+    <w:p>
+      <w:pPr>
+        <w:pStyle w:val="a5"/>
+      </w:pPr>
+      <w:r>
+        <w:t xml:space="preserve">При первом запуске приложение запрашивает только те разрешения, которые необходимы в данный момент. Пользователь может в любое время изменить настройки разрешений через системные параметры </w:t>
+      </w:r>
+      <w:proofErr w:type="spellStart"/>
+      <w:r>
+        <w:t>Android</w:t>
+      </w:r>
+      <w:proofErr w:type="spellEnd"/>
+      <w:r>
+        <w:t>.</w:t>
+      </w:r>
+    </w:p>
+    <w:p>
+      <w:pPr>
+        <w:pStyle w:val="a5"/>
+      </w:pPr>
+      <w:r>
+        <w:t>Защита информации от несанкционированного использования</w:t>
+      </w:r>
+    </w:p>
+    <w:p>
+      <w:pPr>
+        <w:pStyle w:val="a5"/>
+      </w:pPr>
+      <w:r>
+        <w:t>Для предотвращения утечки данных и несанкционированного доступа применяются следующие меры:</w:t>
+      </w:r>
+    </w:p>
+    <w:p>
+      <w:pPr>
+        <w:pStyle w:val="a5"/>
+      </w:pPr>
+      <w:r>
+        <w:t>- ш</w:t>
+      </w:r>
+      <w:r>
+        <w:t>ифрование данных – передача данных между клиентом и сервером осуществляется через защищенный протокол HTTPS</w:t>
       </w:r>
       <w:r>
         <w:t>;</w:t>
@@ -16575,15 +16362,18 @@
         <w:pStyle w:val="a5"/>
       </w:pPr>
       <w:r>
-        <w:t xml:space="preserve">- </w:t>
-      </w:r>
-      <w:proofErr w:type="spellStart"/>
-      <w:r>
-        <w:t>Title</w:t>
-      </w:r>
-      <w:proofErr w:type="spellEnd"/>
-      <w:r>
-        <w:t xml:space="preserve"> — заголовок новости</w:t>
+        <w:t>- х</w:t>
+      </w:r>
+      <w:r>
+        <w:t xml:space="preserve">ранение данных в защищенной среде – </w:t>
+      </w:r>
+      <w:proofErr w:type="spellStart"/>
+      <w:r>
+        <w:t>SQLite</w:t>
+      </w:r>
+      <w:proofErr w:type="spellEnd"/>
+      <w:r>
+        <w:t>-база данных приложения хранится во внутреннем каталоге, недоступном для других приложений</w:t>
       </w:r>
       <w:r>
         <w:t>;</w:t>
@@ -16594,141 +16384,356 @@
         <w:pStyle w:val="a5"/>
       </w:pPr>
       <w:r>
-        <w:t xml:space="preserve">- </w:t>
-      </w:r>
-      <w:proofErr w:type="spellStart"/>
-      <w:r>
-        <w:t>ImageId</w:t>
-      </w:r>
-      <w:proofErr w:type="spellEnd"/>
-      <w:r>
-        <w:t xml:space="preserve"> — идентификатор изображения, связанного с новостью</w:t>
-      </w:r>
-      <w:r>
-        <w:t>;</w:t>
-      </w:r>
-    </w:p>
-    <w:p>
-      <w:pPr>
-        <w:pStyle w:val="a5"/>
-      </w:pPr>
-      <w:r>
-        <w:t xml:space="preserve">- </w:t>
-      </w:r>
-      <w:proofErr w:type="spellStart"/>
-      <w:r>
-        <w:t>ArticleText</w:t>
-      </w:r>
-      <w:proofErr w:type="spellEnd"/>
-      <w:r>
-        <w:t xml:space="preserve"> — основной текст статьи</w:t>
-      </w:r>
-      <w:r>
-        <w:t>.</w:t>
-      </w:r>
-    </w:p>
-    <w:p>
-      <w:pPr>
-        <w:pStyle w:val="a5"/>
-      </w:pPr>
-      <w:r>
-        <w:t>Эта таблица является основной для хранения контента, который будет отображаться пользователям</w:t>
-      </w:r>
-      <w:r>
-        <w:t xml:space="preserve"> – новость.</w:t>
-      </w:r>
-    </w:p>
-    <w:p>
-      <w:pPr>
-        <w:pStyle w:val="32"/>
-      </w:pPr>
-      <w:bookmarkStart w:id="41" w:name="_Toc193231731"/>
-      <w:bookmarkStart w:id="42" w:name="_Toc193271650"/>
-      <w:r>
-        <w:t xml:space="preserve">Таблица </w:t>
-      </w:r>
-      <w:proofErr w:type="spellStart"/>
-      <w:r>
-        <w:t>Users</w:t>
+        <w:t>- л</w:t>
+      </w:r>
+      <w:r>
+        <w:t>ичные данные пользователей хранятся в зашифрованном виде на сервер</w:t>
+      </w:r>
+      <w:r>
+        <w:t>е.</w:t>
+      </w:r>
+    </w:p>
+    <w:p>
+      <w:pPr>
+        <w:pStyle w:val="230"/>
+      </w:pPr>
+      <w:bookmarkStart w:id="41" w:name="_Toc193231729"/>
+      <w:bookmarkStart w:id="42" w:name="_Toc193271648"/>
+      <w:r>
+        <w:t>Организация и ведение информационной базы (модели)</w:t>
       </w:r>
       <w:bookmarkEnd w:id="41"/>
       <w:bookmarkEnd w:id="42"/>
-      <w:proofErr w:type="spellEnd"/>
     </w:p>
     <w:p>
       <w:pPr>
         <w:pStyle w:val="a5"/>
       </w:pPr>
       <w:r>
-        <w:t xml:space="preserve">Таблица </w:t>
-      </w:r>
-      <w:proofErr w:type="spellStart"/>
-      <w:r>
-        <w:t>Users</w:t>
-      </w:r>
-      <w:proofErr w:type="spellEnd"/>
-      <w:r>
-        <w:t xml:space="preserve"> предназначена для хранения информации о пользователях системы. Она включает в себя:</w:t>
+        <w:t>Организация и ведение информационной базы</w:t>
+      </w:r>
+      <w:r>
+        <w:t xml:space="preserve"> приложения </w:t>
+      </w:r>
+      <w:r>
+        <w:t>«</w:t>
+      </w:r>
+      <w:r>
+        <w:t>Спортивные Новости</w:t>
+      </w:r>
+      <w:r>
+        <w:t>»</w:t>
+      </w:r>
+      <w:r>
+        <w:t xml:space="preserve"> </w:t>
+      </w:r>
+      <w:r>
+        <w:t>имеет сложную структуру, которая состоит из 3 систем управления базами данных (</w:t>
+      </w:r>
+      <w:r>
+        <w:rPr>
+          <w:lang w:val="en-US"/>
+        </w:rPr>
+        <w:t>SQL</w:t>
+      </w:r>
+      <w:r>
+        <w:t xml:space="preserve"> </w:t>
+      </w:r>
+      <w:r>
+        <w:rPr>
+          <w:lang w:val="en-US"/>
+        </w:rPr>
+        <w:t>server</w:t>
+      </w:r>
+      <w:r>
+        <w:t xml:space="preserve"> </w:t>
+      </w:r>
+      <w:r>
+        <w:t xml:space="preserve">для работы сервера, </w:t>
+      </w:r>
+      <w:proofErr w:type="spellStart"/>
+      <w:r>
+        <w:rPr>
+          <w:lang w:val="en-US"/>
+        </w:rPr>
+        <w:t>FireBase</w:t>
+      </w:r>
+      <w:proofErr w:type="spellEnd"/>
+      <w:r>
+        <w:t xml:space="preserve"> </w:t>
+      </w:r>
+      <w:r>
+        <w:t xml:space="preserve">хранения пользовательских данных и получения удобных сервисов от данной СУБД, а также </w:t>
+      </w:r>
+      <w:proofErr w:type="spellStart"/>
+      <w:r>
+        <w:rPr>
+          <w:lang w:val="en-US"/>
+        </w:rPr>
+        <w:lastRenderedPageBreak/>
+        <w:t>SQl</w:t>
+      </w:r>
+      <w:proofErr w:type="spellEnd"/>
+      <w:r>
+        <w:t xml:space="preserve"> </w:t>
+      </w:r>
+      <w:r>
+        <w:rPr>
+          <w:lang w:val="en-US"/>
+        </w:rPr>
+        <w:t>lite</w:t>
+      </w:r>
+      <w:r>
+        <w:t xml:space="preserve"> </w:t>
+      </w:r>
+      <w:r>
+        <w:t xml:space="preserve">для организации хранения данных </w:t>
+      </w:r>
+      <w:r>
+        <w:t>локально</w:t>
+      </w:r>
+      <w:r>
+        <w:t xml:space="preserve">), несколько сторонних </w:t>
+      </w:r>
+      <w:r>
+        <w:rPr>
+          <w:lang w:val="en-US"/>
+        </w:rPr>
+        <w:t>API</w:t>
+      </w:r>
+      <w:r>
+        <w:t>, которые предоставляют данные</w:t>
       </w:r>
     </w:p>
     <w:p>
       <w:pPr>
         <w:pStyle w:val="a5"/>
       </w:pPr>
-      <w:proofErr w:type="spellStart"/>
-      <w:r>
-        <w:t>UserEmail</w:t>
-      </w:r>
-      <w:proofErr w:type="spellEnd"/>
-      <w:r>
-        <w:t xml:space="preserve"> — электронная почта пользователя (используется как уникальный идентификатор)</w:t>
-      </w:r>
-      <w:r>
-        <w:t>;</w:t>
-      </w:r>
-    </w:p>
-    <w:p>
-      <w:pPr>
-        <w:pStyle w:val="a5"/>
-      </w:pPr>
-      <w:proofErr w:type="spellStart"/>
-      <w:r>
-        <w:t>UserImage</w:t>
-      </w:r>
-      <w:proofErr w:type="spellEnd"/>
-      <w:r>
-        <w:t xml:space="preserve"> — изображение профиля пользователя.</w:t>
-      </w:r>
-    </w:p>
-    <w:p>
-      <w:pPr>
-        <w:pStyle w:val="a5"/>
-      </w:pPr>
-      <w:r>
-        <w:t>Хотя в таблице немного полей,</w:t>
-      </w:r>
-      <w:r>
-        <w:t xml:space="preserve"> в дальнейшем</w:t>
-      </w:r>
-      <w:r>
-        <w:t xml:space="preserve"> она может быть расширена дополнительными данными, такими как имя, фамилия или предпочтения пользователя.</w:t>
+      <w:r>
+        <w:t xml:space="preserve">База данных </w:t>
+      </w:r>
+      <w:r>
+        <w:t xml:space="preserve">«Спортивные новости» </w:t>
+      </w:r>
+      <w:r>
+        <w:t>на сервере</w:t>
+      </w:r>
+      <w:r>
+        <w:t xml:space="preserve"> предназначена для хранения и управления спортивными новостями и пользовательской информацией. Она состоит из нескольких взаимосвязанных таблиц, каждая из которых выполняет свою роль в обеспечении работы системы.</w:t>
       </w:r>
     </w:p>
     <w:p>
       <w:pPr>
         <w:pStyle w:val="32"/>
       </w:pPr>
-      <w:bookmarkStart w:id="43" w:name="_Toc193231732"/>
-      <w:bookmarkStart w:id="44" w:name="_Toc193271651"/>
-      <w:r>
-        <w:t xml:space="preserve">Таблица </w:t>
-      </w:r>
-      <w:proofErr w:type="spellStart"/>
-      <w:r>
-        <w:t>news_tags</w:t>
+      <w:bookmarkStart w:id="43" w:name="_Toc193231730"/>
+      <w:bookmarkStart w:id="44" w:name="_Toc193271649"/>
+      <w:r>
+        <w:t>Таблица News</w:t>
       </w:r>
       <w:bookmarkEnd w:id="43"/>
       <w:bookmarkEnd w:id="44"/>
+    </w:p>
+    <w:p>
+      <w:pPr>
+        <w:pStyle w:val="a5"/>
+      </w:pPr>
+      <w:r>
+        <w:t>Таблица News отвечает за хранение спортивных новостей. В ней содержатся ключевые поля:</w:t>
+      </w:r>
+    </w:p>
+    <w:p>
+      <w:pPr>
+        <w:pStyle w:val="a5"/>
+      </w:pPr>
+      <w:r>
+        <w:t xml:space="preserve">- </w:t>
+      </w:r>
+      <w:r>
+        <w:t>Sport — вид спорта, к которому относится новость (например, футбол, баскетбол)</w:t>
+      </w:r>
+      <w:r>
+        <w:t>;</w:t>
+      </w:r>
+    </w:p>
+    <w:p>
+      <w:pPr>
+        <w:pStyle w:val="a5"/>
+      </w:pPr>
+      <w:r>
+        <w:t xml:space="preserve">- </w:t>
+      </w:r>
+      <w:proofErr w:type="spellStart"/>
+      <w:r>
+        <w:t>DateTime</w:t>
+      </w:r>
+      <w:proofErr w:type="spellEnd"/>
+      <w:r>
+        <w:t xml:space="preserve"> — дата и время публикации новости (используется как первичный ключ)</w:t>
+      </w:r>
+      <w:r>
+        <w:t>;</w:t>
+      </w:r>
+    </w:p>
+    <w:p>
+      <w:pPr>
+        <w:pStyle w:val="a5"/>
+      </w:pPr>
+      <w:r>
+        <w:t xml:space="preserve">- </w:t>
+      </w:r>
+      <w:proofErr w:type="spellStart"/>
+      <w:r>
+        <w:t>Title</w:t>
+      </w:r>
+      <w:proofErr w:type="spellEnd"/>
+      <w:r>
+        <w:t xml:space="preserve"> — заголовок новости</w:t>
+      </w:r>
+      <w:r>
+        <w:t>;</w:t>
+      </w:r>
+    </w:p>
+    <w:p>
+      <w:pPr>
+        <w:pStyle w:val="a5"/>
+      </w:pPr>
+      <w:r>
+        <w:t xml:space="preserve">- </w:t>
+      </w:r>
+      <w:proofErr w:type="spellStart"/>
+      <w:r>
+        <w:t>ImageId</w:t>
+      </w:r>
+      <w:proofErr w:type="spellEnd"/>
+      <w:r>
+        <w:t xml:space="preserve"> — идентификатор изображения, связанного с новостью</w:t>
+      </w:r>
+      <w:r>
+        <w:t>;</w:t>
+      </w:r>
+    </w:p>
+    <w:p>
+      <w:pPr>
+        <w:pStyle w:val="a5"/>
+      </w:pPr>
+      <w:r>
+        <w:t xml:space="preserve">- </w:t>
+      </w:r>
+      <w:proofErr w:type="spellStart"/>
+      <w:r>
+        <w:t>ArticleText</w:t>
+      </w:r>
+      <w:proofErr w:type="spellEnd"/>
+      <w:r>
+        <w:t xml:space="preserve"> — основной текст статьи</w:t>
+      </w:r>
+      <w:r>
+        <w:t>.</w:t>
+      </w:r>
+    </w:p>
+    <w:p>
+      <w:pPr>
+        <w:pStyle w:val="a5"/>
+      </w:pPr>
+      <w:r>
+        <w:t>Эта таблица является основной для хранения контента, который будет отображаться пользователям</w:t>
+      </w:r>
+      <w:r>
+        <w:t xml:space="preserve"> – новость.</w:t>
+      </w:r>
+    </w:p>
+    <w:p>
+      <w:pPr>
+        <w:pStyle w:val="32"/>
+      </w:pPr>
+      <w:bookmarkStart w:id="45" w:name="_Toc193231731"/>
+      <w:bookmarkStart w:id="46" w:name="_Toc193271650"/>
+      <w:r>
+        <w:t xml:space="preserve">Таблица </w:t>
+      </w:r>
+      <w:proofErr w:type="spellStart"/>
+      <w:r>
+        <w:t>Users</w:t>
+      </w:r>
+      <w:bookmarkEnd w:id="45"/>
+      <w:bookmarkEnd w:id="46"/>
+      <w:proofErr w:type="spellEnd"/>
+    </w:p>
+    <w:p>
+      <w:pPr>
+        <w:pStyle w:val="a5"/>
+      </w:pPr>
+      <w:r>
+        <w:t xml:space="preserve">Таблица </w:t>
+      </w:r>
+      <w:proofErr w:type="spellStart"/>
+      <w:r>
+        <w:t>Users</w:t>
+      </w:r>
+      <w:proofErr w:type="spellEnd"/>
+      <w:r>
+        <w:t xml:space="preserve"> предназначена для хранения информации о пользователях системы. Она включает в себя:</w:t>
+      </w:r>
+    </w:p>
+    <w:p>
+      <w:pPr>
+        <w:pStyle w:val="a5"/>
+      </w:pPr>
+      <w:proofErr w:type="spellStart"/>
+      <w:r>
+        <w:t>UserEmail</w:t>
+      </w:r>
+      <w:proofErr w:type="spellEnd"/>
+      <w:r>
+        <w:t xml:space="preserve"> — электронная почта пользователя (используется как уникальный идентификатор)</w:t>
+      </w:r>
+      <w:r>
+        <w:t>;</w:t>
+      </w:r>
+    </w:p>
+    <w:p>
+      <w:pPr>
+        <w:pStyle w:val="a5"/>
+      </w:pPr>
+      <w:proofErr w:type="spellStart"/>
+      <w:r>
+        <w:t>UserImage</w:t>
+      </w:r>
+      <w:proofErr w:type="spellEnd"/>
+      <w:r>
+        <w:t xml:space="preserve"> — изображение профиля пользователя.</w:t>
+      </w:r>
+    </w:p>
+    <w:p>
+      <w:pPr>
+        <w:pStyle w:val="a5"/>
+      </w:pPr>
+      <w:r>
+        <w:t>Хотя в таблице немного полей,</w:t>
+      </w:r>
+      <w:r>
+        <w:t xml:space="preserve"> в дальнейшем</w:t>
+      </w:r>
+      <w:r>
+        <w:t xml:space="preserve"> она может быть расширена дополнительными данными, такими как имя, фамилия или предпочтения пользователя.</w:t>
+      </w:r>
+    </w:p>
+    <w:p>
+      <w:pPr>
+        <w:pStyle w:val="32"/>
+      </w:pPr>
+      <w:bookmarkStart w:id="47" w:name="_Toc193231732"/>
+      <w:bookmarkStart w:id="48" w:name="_Toc193271651"/>
+      <w:r>
+        <w:t xml:space="preserve">Таблица </w:t>
+      </w:r>
+      <w:proofErr w:type="spellStart"/>
+      <w:r>
+        <w:t>news_tags</w:t>
+      </w:r>
+      <w:bookmarkEnd w:id="47"/>
+      <w:bookmarkEnd w:id="48"/>
       <w:proofErr w:type="spellEnd"/>
     </w:p>
     <w:p>
@@ -16775,7 +16780,6 @@
       </w:pPr>
       <w:proofErr w:type="spellStart"/>
       <w:r>
-        <w:lastRenderedPageBreak/>
         <w:t>NewsDateTime</w:t>
       </w:r>
       <w:proofErr w:type="spellEnd"/>
@@ -16825,6 +16829,7 @@
         <w:pStyle w:val="a5"/>
       </w:pPr>
       <w:r>
+        <w:lastRenderedPageBreak/>
         <w:t xml:space="preserve">Связь между таблицами News и </w:t>
       </w:r>
       <w:proofErr w:type="spellStart"/>
@@ -16957,13 +16962,13 @@
       <w:pPr>
         <w:pStyle w:val="32"/>
       </w:pPr>
-      <w:bookmarkStart w:id="45" w:name="_Toc193231733"/>
-      <w:bookmarkStart w:id="46" w:name="_Toc193271652"/>
+      <w:bookmarkStart w:id="49" w:name="_Toc193231733"/>
+      <w:bookmarkStart w:id="50" w:name="_Toc193271652"/>
       <w:r>
         <w:t>Связи между таблицами</w:t>
       </w:r>
-      <w:bookmarkEnd w:id="45"/>
-      <w:bookmarkEnd w:id="46"/>
+      <w:bookmarkEnd w:id="49"/>
+      <w:bookmarkEnd w:id="50"/>
     </w:p>
     <w:p>
       <w:pPr>
@@ -17134,7 +17139,6 @@
         <w:pStyle w:val="a5"/>
       </w:pPr>
       <w:r>
-        <w:lastRenderedPageBreak/>
         <w:t xml:space="preserve">- </w:t>
       </w:r>
       <w:proofErr w:type="spellStart"/>
@@ -17182,6 +17186,7 @@
         <w:ind w:firstLine="708"/>
       </w:pPr>
       <w:r>
+        <w:lastRenderedPageBreak/>
         <w:t>- в</w:t>
       </w:r>
       <w:r>
@@ -17213,482 +17218,482 @@
       <w:pPr>
         <w:pStyle w:val="110"/>
       </w:pPr>
-      <w:bookmarkStart w:id="47" w:name="_Toc193231734"/>
-      <w:bookmarkStart w:id="48" w:name="_Toc193271653"/>
+      <w:bookmarkStart w:id="51" w:name="_Toc193231734"/>
+      <w:bookmarkStart w:id="52" w:name="_Toc193271653"/>
       <w:r>
         <w:lastRenderedPageBreak/>
         <w:t>Реализация мобильного приложения</w:t>
       </w:r>
-      <w:bookmarkEnd w:id="47"/>
-      <w:bookmarkEnd w:id="48"/>
-    </w:p>
-    <w:p>
-      <w:pPr>
-        <w:pStyle w:val="220"/>
-      </w:pPr>
-      <w:bookmarkStart w:id="49" w:name="_Toc193231735"/>
-      <w:bookmarkStart w:id="50" w:name="_Toc193271654"/>
-      <w:r>
-        <w:t>Программно-технические средства, необходимые для разработки</w:t>
-      </w:r>
-      <w:r>
-        <w:t xml:space="preserve"> </w:t>
-      </w:r>
-      <w:r>
-        <w:t>приложения</w:t>
-      </w:r>
-      <w:bookmarkEnd w:id="49"/>
-      <w:bookmarkEnd w:id="50"/>
-    </w:p>
-    <w:p>
-      <w:pPr>
-        <w:pStyle w:val="a5"/>
-      </w:pPr>
-      <w:r>
-        <w:t xml:space="preserve">Для разработки приложения </w:t>
-      </w:r>
-      <w:r>
-        <w:t>«</w:t>
-      </w:r>
-      <w:r>
-        <w:t>Спортивные Новости</w:t>
-      </w:r>
-      <w:r>
-        <w:t>»</w:t>
-      </w:r>
-      <w:r>
-        <w:t>, были выбраны такие технологии как</w:t>
-      </w:r>
-      <w:r>
-        <w:rPr>
-          <w:lang w:val="be-BY"/>
-        </w:rPr>
-        <w:t xml:space="preserve">: </w:t>
-      </w:r>
-      <w:r>
-        <w:rPr>
-          <w:lang w:val="en-US"/>
-        </w:rPr>
-        <w:t>C</w:t>
-      </w:r>
-      <w:r>
-        <w:t xml:space="preserve">#, </w:t>
-      </w:r>
-      <w:r>
-        <w:rPr>
-          <w:lang w:val="en-US"/>
-        </w:rPr>
-        <w:t>Kotlin</w:t>
-      </w:r>
-      <w:r>
-        <w:t xml:space="preserve">, </w:t>
-      </w:r>
-      <w:r>
-        <w:rPr>
-          <w:lang w:val="en-US"/>
-        </w:rPr>
-        <w:t>SQL</w:t>
-      </w:r>
-      <w:r>
-        <w:t xml:space="preserve"> </w:t>
-      </w:r>
-      <w:r>
-        <w:rPr>
-          <w:lang w:val="en-US"/>
-        </w:rPr>
-        <w:t>Server</w:t>
-      </w:r>
-      <w:r>
-        <w:t xml:space="preserve">, </w:t>
-      </w:r>
-      <w:proofErr w:type="spellStart"/>
-      <w:r>
-        <w:rPr>
-          <w:lang w:val="en-US"/>
-        </w:rPr>
-        <w:t>FireBase</w:t>
-      </w:r>
-      <w:proofErr w:type="spellEnd"/>
-      <w:r>
-        <w:t xml:space="preserve">, </w:t>
-      </w:r>
-      <w:r>
-        <w:rPr>
-          <w:lang w:val="en-US"/>
-        </w:rPr>
-        <w:t>selenium</w:t>
-      </w:r>
-      <w:r>
-        <w:t xml:space="preserve"> </w:t>
-      </w:r>
-      <w:r>
-        <w:t>и др.</w:t>
-      </w:r>
-    </w:p>
-    <w:p>
-      <w:pPr>
-        <w:pStyle w:val="a5"/>
-      </w:pPr>
-      <w:r>
-        <w:t>Каждая технология используется для разных компонентов</w:t>
-      </w:r>
-      <w:r>
-        <w:t>.</w:t>
-      </w:r>
-      <w:r>
-        <w:t xml:space="preserve"> </w:t>
-      </w:r>
-      <w:r>
-        <w:t>Т</w:t>
-      </w:r>
-      <w:r>
-        <w:t>ак, например,</w:t>
-      </w:r>
-      <w:r>
-        <w:t xml:space="preserve"> </w:t>
-      </w:r>
-      <w:r>
-        <w:t xml:space="preserve">при помощи </w:t>
-      </w:r>
-      <w:r>
-        <w:rPr>
-          <w:lang w:val="en-US"/>
-        </w:rPr>
-        <w:t>ASP</w:t>
-      </w:r>
-      <w:r>
-        <w:t>.</w:t>
-      </w:r>
-      <w:r>
-        <w:rPr>
-          <w:lang w:val="en-US"/>
-        </w:rPr>
-        <w:t>Net</w:t>
-      </w:r>
-      <w:r>
-        <w:t xml:space="preserve">, </w:t>
-      </w:r>
-      <w:r>
-        <w:rPr>
-          <w:lang w:val="en-US"/>
-        </w:rPr>
-        <w:t>C</w:t>
-      </w:r>
-      <w:r>
-        <w:t>#</w:t>
-      </w:r>
-      <w:r>
-        <w:t xml:space="preserve"> реализуется серверная часть приложения, которая выполняет важную роль при использовании приложения.</w:t>
-      </w:r>
-      <w:r>
-        <w:t xml:space="preserve"> C# — это современный объектно-ориентированный язык программирования, разработанный Microsoft. Он используется для создания серверной части приложения благодаря своей производительности и широким возможностям. C# интегрируется с платформой ASP.NET, что позволяет разрабатывать надежные и безопасные веб-приложения. Также язык поддерживает асинхронное программирование, что улучшает отзывчивость серверной части.</w:t>
-      </w:r>
-    </w:p>
-    <w:p>
-      <w:pPr>
-        <w:pStyle w:val="a5"/>
-      </w:pPr>
-      <w:r>
-        <w:t xml:space="preserve"> </w:t>
-      </w:r>
-      <w:proofErr w:type="spellStart"/>
-      <w:r>
-        <w:rPr>
-          <w:lang w:val="en-US"/>
-        </w:rPr>
-        <w:t>JetPack</w:t>
-      </w:r>
-      <w:proofErr w:type="spellEnd"/>
-      <w:r>
-        <w:t xml:space="preserve"> </w:t>
-      </w:r>
-      <w:r>
-        <w:rPr>
-          <w:lang w:val="en-US"/>
-        </w:rPr>
-        <w:t>Compose</w:t>
-      </w:r>
-      <w:r>
-        <w:t xml:space="preserve"> </w:t>
-      </w:r>
-      <w:r>
-        <w:t xml:space="preserve">отлично подходит </w:t>
-      </w:r>
-      <w:r>
-        <w:t>для</w:t>
-      </w:r>
-      <w:r>
-        <w:t xml:space="preserve"> создания</w:t>
-      </w:r>
-      <w:r>
-        <w:t xml:space="preserve"> декларативного написанного</w:t>
-      </w:r>
-      <w:r>
-        <w:t xml:space="preserve"> интерфейса и клиентской части приложения для андроида, а так же в будущем такую реализацию при</w:t>
-      </w:r>
-      <w:r>
-        <w:t>ложе</w:t>
-      </w:r>
-      <w:r>
-        <w:t>н</w:t>
-      </w:r>
-      <w:r>
-        <w:t>ия</w:t>
-      </w:r>
-      <w:r>
-        <w:t xml:space="preserve"> легко пер</w:t>
-      </w:r>
-      <w:r>
-        <w:t>е</w:t>
-      </w:r>
-      <w:r>
-        <w:t>вести</w:t>
-      </w:r>
-      <w:r>
-        <w:t xml:space="preserve"> </w:t>
-      </w:r>
-      <w:r>
-        <w:t>на другие платформы</w:t>
-      </w:r>
-      <w:r>
-        <w:rPr>
-          <w:lang w:val="be-BY"/>
-        </w:rPr>
-        <w:t xml:space="preserve"> </w:t>
-      </w:r>
-      <w:r>
-        <w:t xml:space="preserve">благодаря </w:t>
-      </w:r>
-      <w:r>
-        <w:rPr>
-          <w:lang w:val="en-US"/>
-        </w:rPr>
-        <w:t>multiplatform</w:t>
-      </w:r>
-      <w:r>
-        <w:t xml:space="preserve">, </w:t>
-      </w:r>
-      <w:proofErr w:type="spellStart"/>
-      <w:r>
-        <w:t>Kotlin</w:t>
-      </w:r>
-      <w:proofErr w:type="spellEnd"/>
-      <w:r>
-        <w:t xml:space="preserve"> — это современный язык программирования, который официально поддерживается Google для разработки </w:t>
-      </w:r>
-      <w:proofErr w:type="spellStart"/>
-      <w:r>
-        <w:t>Android</w:t>
-      </w:r>
-      <w:proofErr w:type="spellEnd"/>
-      <w:r>
-        <w:t>-приложений.</w:t>
-      </w:r>
-      <w:r>
-        <w:rPr>
-          <w:rFonts w:asciiTheme="minorHAnsi" w:eastAsia="SimSun" w:hAnsiTheme="minorHAnsi" w:cs="SimSun"/>
-        </w:rPr>
-        <w:t xml:space="preserve"> </w:t>
-      </w:r>
-      <w:proofErr w:type="spellStart"/>
-      <w:r>
-        <w:t>Kotlin</w:t>
-      </w:r>
-      <w:proofErr w:type="spellEnd"/>
-      <w:r>
-        <w:t xml:space="preserve"> полностью совместим с Java, что позволяет использовать существующие библиотеки и </w:t>
-      </w:r>
-      <w:proofErr w:type="spellStart"/>
-      <w:r>
-        <w:t>frameworks</w:t>
-      </w:r>
-      <w:proofErr w:type="spellEnd"/>
-      <w:r>
-        <w:t xml:space="preserve">. В сочетании с </w:t>
-      </w:r>
-      <w:proofErr w:type="spellStart"/>
-      <w:r>
-        <w:t>Jetpack</w:t>
-      </w:r>
-      <w:proofErr w:type="spellEnd"/>
-      <w:r>
-        <w:t xml:space="preserve"> </w:t>
-      </w:r>
-      <w:proofErr w:type="spellStart"/>
-      <w:r>
-        <w:t>Compose</w:t>
-      </w:r>
-      <w:proofErr w:type="spellEnd"/>
-      <w:r>
-        <w:t xml:space="preserve"> он становится идеальным выбором для создания современных пользовательских интерфейсов.</w:t>
-      </w:r>
-    </w:p>
-    <w:p>
-      <w:pPr>
-        <w:pStyle w:val="a5"/>
-      </w:pPr>
-      <w:proofErr w:type="spellStart"/>
-      <w:r>
-        <w:t>Firebase</w:t>
-      </w:r>
-      <w:proofErr w:type="spellEnd"/>
-      <w:r>
-        <w:t xml:space="preserve"> — это платформа для разработки мобильных и веб-приложений, предоставляющая множество готовых решений. Она включает </w:t>
-      </w:r>
-      <w:proofErr w:type="spellStart"/>
-      <w:r>
-        <w:t>Firestore</w:t>
-      </w:r>
-      <w:proofErr w:type="spellEnd"/>
-      <w:r>
-        <w:t xml:space="preserve"> для хранения данных в реальном времени, что идеально подходит для чатов или динамических обновлений. </w:t>
-      </w:r>
-      <w:proofErr w:type="spellStart"/>
-      <w:r>
-        <w:t>Firebase</w:t>
-      </w:r>
-      <w:proofErr w:type="spellEnd"/>
-      <w:r>
-        <w:t xml:space="preserve"> также предлагает сервисы для </w:t>
-      </w:r>
-      <w:proofErr w:type="spellStart"/>
-      <w:r>
-        <w:t>пуш</w:t>
-      </w:r>
-      <w:proofErr w:type="spellEnd"/>
-      <w:r>
-        <w:t>-уведомлений, авторизации пользователей и аналитики. Это значительно ускоряет разработку и упрощает поддержку приложения.</w:t>
-      </w:r>
-      <w:r>
-        <w:t xml:space="preserve"> </w:t>
-      </w:r>
-      <w:proofErr w:type="spellStart"/>
-      <w:r>
-        <w:rPr>
-          <w:lang w:val="en-US"/>
-        </w:rPr>
-        <w:t>FireBase</w:t>
-      </w:r>
-      <w:proofErr w:type="spellEnd"/>
-      <w:r>
-        <w:t xml:space="preserve"> </w:t>
-      </w:r>
-      <w:r>
-        <w:t>предоставля</w:t>
-      </w:r>
-      <w:r>
-        <w:t>ет</w:t>
-      </w:r>
-      <w:r>
-        <w:t xml:space="preserve"> раз</w:t>
-      </w:r>
-      <w:r>
-        <w:t>ли</w:t>
-      </w:r>
-      <w:r>
-        <w:t>чные удобные сервисы такие как:</w:t>
-      </w:r>
-    </w:p>
-    <w:p>
-      <w:pPr>
-        <w:pStyle w:val="a5"/>
-      </w:pPr>
-      <w:r>
-        <w:t xml:space="preserve">- </w:t>
-      </w:r>
-      <w:proofErr w:type="spellStart"/>
-      <w:r>
-        <w:t>нереляционные</w:t>
-      </w:r>
-      <w:proofErr w:type="spellEnd"/>
-      <w:r>
-        <w:t xml:space="preserve"> базы данных</w:t>
-      </w:r>
-      <w:r>
-        <w:t>;</w:t>
-      </w:r>
-    </w:p>
-    <w:p>
-      <w:pPr>
-        <w:pStyle w:val="a5"/>
-      </w:pPr>
-      <w:r>
-        <w:t xml:space="preserve">- </w:t>
-      </w:r>
-      <w:proofErr w:type="spellStart"/>
-      <w:r>
-        <w:t>пуш</w:t>
-      </w:r>
-      <w:proofErr w:type="spellEnd"/>
-      <w:r>
-        <w:t>-уведомления и по</w:t>
-      </w:r>
-      <w:r>
-        <w:t>д</w:t>
-      </w:r>
-      <w:r>
-        <w:t xml:space="preserve">писки на тему </w:t>
-      </w:r>
-      <w:proofErr w:type="spellStart"/>
-      <w:r>
-        <w:t>пуш</w:t>
-      </w:r>
-      <w:proofErr w:type="spellEnd"/>
-      <w:r>
-        <w:t>-уведомлений</w:t>
-      </w:r>
-      <w:r>
-        <w:t>;</w:t>
-      </w:r>
-    </w:p>
-    <w:p>
-      <w:pPr>
-        <w:pStyle w:val="a5"/>
-      </w:pPr>
-      <w:r>
-        <w:t>- авторизаци</w:t>
-      </w:r>
-      <w:r>
-        <w:t>я</w:t>
-      </w:r>
-      <w:r>
-        <w:t xml:space="preserve"> по почте</w:t>
-      </w:r>
-      <w:r>
-        <w:t>.</w:t>
-      </w:r>
-    </w:p>
-    <w:p>
-      <w:pPr>
-        <w:pStyle w:val="a5"/>
-      </w:pPr>
-      <w:r>
-        <w:t>И</w:t>
-      </w:r>
-      <w:r>
-        <w:t xml:space="preserve"> др</w:t>
-      </w:r>
-      <w:r>
-        <w:t>угие сервисы также могут быть использованы при дальнейшем расширении приложения.</w:t>
-      </w:r>
-    </w:p>
-    <w:p>
-      <w:pPr>
-        <w:pStyle w:val="230"/>
-        <w:rPr>
-          <w:szCs w:val="24"/>
-        </w:rPr>
-      </w:pPr>
-      <w:bookmarkStart w:id="51" w:name="_Toc193231736"/>
-      <w:bookmarkStart w:id="52" w:name="_Toc193271655"/>
-      <w:r>
-        <w:t>Описание разделов приложения</w:t>
-      </w:r>
       <w:bookmarkEnd w:id="51"/>
       <w:bookmarkEnd w:id="52"/>
     </w:p>
     <w:p>
       <w:pPr>
+        <w:pStyle w:val="220"/>
+      </w:pPr>
+      <w:bookmarkStart w:id="53" w:name="_Toc193231735"/>
+      <w:bookmarkStart w:id="54" w:name="_Toc193271654"/>
+      <w:r>
+        <w:t>Программно-технические средства, необходимые для разработки</w:t>
+      </w:r>
+      <w:r>
+        <w:t xml:space="preserve"> </w:t>
+      </w:r>
+      <w:r>
+        <w:t>приложения</w:t>
+      </w:r>
+      <w:bookmarkEnd w:id="53"/>
+      <w:bookmarkEnd w:id="54"/>
+    </w:p>
+    <w:p>
+      <w:pPr>
+        <w:pStyle w:val="a5"/>
+      </w:pPr>
+      <w:r>
+        <w:t xml:space="preserve">Для разработки приложения </w:t>
+      </w:r>
+      <w:r>
+        <w:t>«</w:t>
+      </w:r>
+      <w:r>
+        <w:t>Спортивные Новости</w:t>
+      </w:r>
+      <w:r>
+        <w:t>»</w:t>
+      </w:r>
+      <w:r>
+        <w:t>, были выбраны такие технологии как</w:t>
+      </w:r>
+      <w:r>
+        <w:rPr>
+          <w:lang w:val="be-BY"/>
+        </w:rPr>
+        <w:t xml:space="preserve">: </w:t>
+      </w:r>
+      <w:r>
+        <w:rPr>
+          <w:lang w:val="en-US"/>
+        </w:rPr>
+        <w:t>C</w:t>
+      </w:r>
+      <w:r>
+        <w:t xml:space="preserve">#, </w:t>
+      </w:r>
+      <w:r>
+        <w:rPr>
+          <w:lang w:val="en-US"/>
+        </w:rPr>
+        <w:t>Kotlin</w:t>
+      </w:r>
+      <w:r>
+        <w:t xml:space="preserve">, </w:t>
+      </w:r>
+      <w:r>
+        <w:rPr>
+          <w:lang w:val="en-US"/>
+        </w:rPr>
+        <w:t>SQL</w:t>
+      </w:r>
+      <w:r>
+        <w:t xml:space="preserve"> </w:t>
+      </w:r>
+      <w:r>
+        <w:rPr>
+          <w:lang w:val="en-US"/>
+        </w:rPr>
+        <w:t>Server</w:t>
+      </w:r>
+      <w:r>
+        <w:t xml:space="preserve">, </w:t>
+      </w:r>
+      <w:proofErr w:type="spellStart"/>
+      <w:r>
+        <w:rPr>
+          <w:lang w:val="en-US"/>
+        </w:rPr>
+        <w:t>FireBase</w:t>
+      </w:r>
+      <w:proofErr w:type="spellEnd"/>
+      <w:r>
+        <w:t xml:space="preserve">, </w:t>
+      </w:r>
+      <w:r>
+        <w:rPr>
+          <w:lang w:val="en-US"/>
+        </w:rPr>
+        <w:t>selenium</w:t>
+      </w:r>
+      <w:r>
+        <w:t xml:space="preserve"> </w:t>
+      </w:r>
+      <w:r>
+        <w:t>и др.</w:t>
+      </w:r>
+    </w:p>
+    <w:p>
+      <w:pPr>
+        <w:pStyle w:val="a5"/>
+      </w:pPr>
+      <w:r>
+        <w:t>Каждая технология используется для разных компонентов</w:t>
+      </w:r>
+      <w:r>
+        <w:t>.</w:t>
+      </w:r>
+      <w:r>
+        <w:t xml:space="preserve"> </w:t>
+      </w:r>
+      <w:r>
+        <w:t>Т</w:t>
+      </w:r>
+      <w:r>
+        <w:t>ак, например,</w:t>
+      </w:r>
+      <w:r>
+        <w:t xml:space="preserve"> </w:t>
+      </w:r>
+      <w:r>
+        <w:t xml:space="preserve">при помощи </w:t>
+      </w:r>
+      <w:r>
+        <w:rPr>
+          <w:lang w:val="en-US"/>
+        </w:rPr>
+        <w:t>ASP</w:t>
+      </w:r>
+      <w:r>
+        <w:t>.</w:t>
+      </w:r>
+      <w:r>
+        <w:rPr>
+          <w:lang w:val="en-US"/>
+        </w:rPr>
+        <w:t>Net</w:t>
+      </w:r>
+      <w:r>
+        <w:t xml:space="preserve">, </w:t>
+      </w:r>
+      <w:r>
+        <w:rPr>
+          <w:lang w:val="en-US"/>
+        </w:rPr>
+        <w:t>C</w:t>
+      </w:r>
+      <w:r>
+        <w:t>#</w:t>
+      </w:r>
+      <w:r>
+        <w:t xml:space="preserve"> реализуется серверная часть приложения, которая выполняет важную роль при использовании приложения.</w:t>
+      </w:r>
+      <w:r>
+        <w:t xml:space="preserve"> C# — это современный объектно-ориентированный язык программирования, разработанный Microsoft. Он используется для создания серверной части приложения благодаря своей производительности и широким возможностям. C# интегрируется с платформой ASP.NET, что позволяет разрабатывать надежные и безопасные веб-приложения. Также язык поддерживает асинхронное программирование, что улучшает отзывчивость серверной части.</w:t>
+      </w:r>
+    </w:p>
+    <w:p>
+      <w:pPr>
+        <w:pStyle w:val="a5"/>
+      </w:pPr>
+      <w:r>
+        <w:t xml:space="preserve"> </w:t>
+      </w:r>
+      <w:proofErr w:type="spellStart"/>
+      <w:r>
+        <w:rPr>
+          <w:lang w:val="en-US"/>
+        </w:rPr>
+        <w:t>JetPack</w:t>
+      </w:r>
+      <w:proofErr w:type="spellEnd"/>
+      <w:r>
+        <w:t xml:space="preserve"> </w:t>
+      </w:r>
+      <w:r>
+        <w:rPr>
+          <w:lang w:val="en-US"/>
+        </w:rPr>
+        <w:t>Compose</w:t>
+      </w:r>
+      <w:r>
+        <w:t xml:space="preserve"> </w:t>
+      </w:r>
+      <w:r>
+        <w:t xml:space="preserve">отлично подходит </w:t>
+      </w:r>
+      <w:r>
+        <w:t>для</w:t>
+      </w:r>
+      <w:r>
+        <w:t xml:space="preserve"> создания</w:t>
+      </w:r>
+      <w:r>
+        <w:t xml:space="preserve"> декларативного написанного</w:t>
+      </w:r>
+      <w:r>
+        <w:t xml:space="preserve"> интерфейса и клиентской части приложения для андроида, а так же в будущем такую реализацию при</w:t>
+      </w:r>
+      <w:r>
+        <w:t>ложе</w:t>
+      </w:r>
+      <w:r>
+        <w:t>н</w:t>
+      </w:r>
+      <w:r>
+        <w:t>ия</w:t>
+      </w:r>
+      <w:r>
+        <w:t xml:space="preserve"> легко пер</w:t>
+      </w:r>
+      <w:r>
+        <w:t>е</w:t>
+      </w:r>
+      <w:r>
+        <w:t>вести</w:t>
+      </w:r>
+      <w:r>
+        <w:t xml:space="preserve"> </w:t>
+      </w:r>
+      <w:r>
+        <w:t>на другие платформы</w:t>
+      </w:r>
+      <w:r>
+        <w:rPr>
+          <w:lang w:val="be-BY"/>
+        </w:rPr>
+        <w:t xml:space="preserve"> </w:t>
+      </w:r>
+      <w:r>
+        <w:t xml:space="preserve">благодаря </w:t>
+      </w:r>
+      <w:r>
+        <w:rPr>
+          <w:lang w:val="en-US"/>
+        </w:rPr>
+        <w:t>multiplatform</w:t>
+      </w:r>
+      <w:r>
+        <w:t xml:space="preserve">, </w:t>
+      </w:r>
+      <w:proofErr w:type="spellStart"/>
+      <w:r>
+        <w:t>Kotlin</w:t>
+      </w:r>
+      <w:proofErr w:type="spellEnd"/>
+      <w:r>
+        <w:t xml:space="preserve"> — это современный язык программирования, который официально поддерживается Google для разработки </w:t>
+      </w:r>
+      <w:proofErr w:type="spellStart"/>
+      <w:r>
+        <w:t>Android</w:t>
+      </w:r>
+      <w:proofErr w:type="spellEnd"/>
+      <w:r>
+        <w:t>-приложений.</w:t>
+      </w:r>
+      <w:r>
+        <w:rPr>
+          <w:rFonts w:asciiTheme="minorHAnsi" w:eastAsia="SimSun" w:hAnsiTheme="minorHAnsi" w:cs="SimSun"/>
+        </w:rPr>
+        <w:t xml:space="preserve"> </w:t>
+      </w:r>
+      <w:proofErr w:type="spellStart"/>
+      <w:r>
+        <w:t>Kotlin</w:t>
+      </w:r>
+      <w:proofErr w:type="spellEnd"/>
+      <w:r>
+        <w:t xml:space="preserve"> полностью совместим с Java, что позволяет использовать существующие библиотеки и </w:t>
+      </w:r>
+      <w:proofErr w:type="spellStart"/>
+      <w:r>
+        <w:t>frameworks</w:t>
+      </w:r>
+      <w:proofErr w:type="spellEnd"/>
+      <w:r>
+        <w:t xml:space="preserve">. В сочетании с </w:t>
+      </w:r>
+      <w:proofErr w:type="spellStart"/>
+      <w:r>
+        <w:t>Jetpack</w:t>
+      </w:r>
+      <w:proofErr w:type="spellEnd"/>
+      <w:r>
+        <w:t xml:space="preserve"> </w:t>
+      </w:r>
+      <w:proofErr w:type="spellStart"/>
+      <w:r>
+        <w:t>Compose</w:t>
+      </w:r>
+      <w:proofErr w:type="spellEnd"/>
+      <w:r>
+        <w:t xml:space="preserve"> он становится идеальным выбором для создания современных пользовательских интерфейсов.</w:t>
+      </w:r>
+    </w:p>
+    <w:p>
+      <w:pPr>
+        <w:pStyle w:val="a5"/>
+      </w:pPr>
+      <w:proofErr w:type="spellStart"/>
+      <w:r>
+        <w:t>Firebase</w:t>
+      </w:r>
+      <w:proofErr w:type="spellEnd"/>
+      <w:r>
+        <w:t xml:space="preserve"> — это платформа для разработки мобильных и веб-приложений, предоставляющая множество готовых решений. Она включает </w:t>
+      </w:r>
+      <w:proofErr w:type="spellStart"/>
+      <w:r>
+        <w:t>Firestore</w:t>
+      </w:r>
+      <w:proofErr w:type="spellEnd"/>
+      <w:r>
+        <w:t xml:space="preserve"> для хранения данных в реальном времени, что идеально подходит для чатов или динамических обновлений. </w:t>
+      </w:r>
+      <w:proofErr w:type="spellStart"/>
+      <w:r>
+        <w:t>Firebase</w:t>
+      </w:r>
+      <w:proofErr w:type="spellEnd"/>
+      <w:r>
+        <w:t xml:space="preserve"> также предлагает сервисы для </w:t>
+      </w:r>
+      <w:proofErr w:type="spellStart"/>
+      <w:r>
+        <w:t>пуш</w:t>
+      </w:r>
+      <w:proofErr w:type="spellEnd"/>
+      <w:r>
+        <w:t>-уведомлений, авторизации пользователей и аналитики. Это значительно ускоряет разработку и упрощает поддержку приложения.</w:t>
+      </w:r>
+      <w:r>
+        <w:t xml:space="preserve"> </w:t>
+      </w:r>
+      <w:proofErr w:type="spellStart"/>
+      <w:r>
+        <w:rPr>
+          <w:lang w:val="en-US"/>
+        </w:rPr>
+        <w:t>FireBase</w:t>
+      </w:r>
+      <w:proofErr w:type="spellEnd"/>
+      <w:r>
+        <w:t xml:space="preserve"> </w:t>
+      </w:r>
+      <w:r>
+        <w:t>предоставля</w:t>
+      </w:r>
+      <w:r>
+        <w:t>ет</w:t>
+      </w:r>
+      <w:r>
+        <w:t xml:space="preserve"> раз</w:t>
+      </w:r>
+      <w:r>
+        <w:t>ли</w:t>
+      </w:r>
+      <w:r>
+        <w:t>чные удобные сервисы такие как:</w:t>
+      </w:r>
+    </w:p>
+    <w:p>
+      <w:pPr>
+        <w:pStyle w:val="a5"/>
+      </w:pPr>
+      <w:r>
+        <w:t xml:space="preserve">- </w:t>
+      </w:r>
+      <w:proofErr w:type="spellStart"/>
+      <w:r>
+        <w:t>нереляционные</w:t>
+      </w:r>
+      <w:proofErr w:type="spellEnd"/>
+      <w:r>
+        <w:t xml:space="preserve"> базы данных</w:t>
+      </w:r>
+      <w:r>
+        <w:t>;</w:t>
+      </w:r>
+    </w:p>
+    <w:p>
+      <w:pPr>
+        <w:pStyle w:val="a5"/>
+      </w:pPr>
+      <w:r>
+        <w:t xml:space="preserve">- </w:t>
+      </w:r>
+      <w:proofErr w:type="spellStart"/>
+      <w:r>
+        <w:t>пуш</w:t>
+      </w:r>
+      <w:proofErr w:type="spellEnd"/>
+      <w:r>
+        <w:t>-уведомления и по</w:t>
+      </w:r>
+      <w:r>
+        <w:t>д</w:t>
+      </w:r>
+      <w:r>
+        <w:t xml:space="preserve">писки на тему </w:t>
+      </w:r>
+      <w:proofErr w:type="spellStart"/>
+      <w:r>
+        <w:t>пуш</w:t>
+      </w:r>
+      <w:proofErr w:type="spellEnd"/>
+      <w:r>
+        <w:t>-уведомлений</w:t>
+      </w:r>
+      <w:r>
+        <w:t>;</w:t>
+      </w:r>
+    </w:p>
+    <w:p>
+      <w:pPr>
+        <w:pStyle w:val="a5"/>
+      </w:pPr>
+      <w:r>
+        <w:t>- авторизаци</w:t>
+      </w:r>
+      <w:r>
+        <w:t>я</w:t>
+      </w:r>
+      <w:r>
+        <w:t xml:space="preserve"> по почте</w:t>
+      </w:r>
+      <w:r>
+        <w:t>.</w:t>
+      </w:r>
+    </w:p>
+    <w:p>
+      <w:pPr>
+        <w:pStyle w:val="a5"/>
+      </w:pPr>
+      <w:r>
+        <w:t>И</w:t>
+      </w:r>
+      <w:r>
+        <w:t xml:space="preserve"> др</w:t>
+      </w:r>
+      <w:r>
+        <w:t>угие сервисы также могут быть использованы при дальнейшем расширении приложения.</w:t>
+      </w:r>
+    </w:p>
+    <w:p>
+      <w:pPr>
+        <w:pStyle w:val="230"/>
+        <w:rPr>
+          <w:szCs w:val="24"/>
+        </w:rPr>
+      </w:pPr>
+      <w:bookmarkStart w:id="55" w:name="_Toc193231736"/>
+      <w:bookmarkStart w:id="56" w:name="_Toc193271655"/>
+      <w:r>
+        <w:t>Описание разделов приложения</w:t>
+      </w:r>
+      <w:bookmarkEnd w:id="55"/>
+      <w:bookmarkEnd w:id="56"/>
+    </w:p>
+    <w:p>
+      <w:pPr>
         <w:pStyle w:val="a5"/>
         <w:rPr>
           <w:szCs w:val="24"/>
@@ -18068,13 +18073,13 @@
       <w:pPr>
         <w:pStyle w:val="230"/>
       </w:pPr>
-      <w:bookmarkStart w:id="53" w:name="_Toc193231738"/>
-      <w:bookmarkStart w:id="54" w:name="_Toc193271656"/>
+      <w:bookmarkStart w:id="57" w:name="_Toc193231738"/>
+      <w:bookmarkStart w:id="58" w:name="_Toc193271656"/>
       <w:r>
         <w:t>Функциональное тестирование</w:t>
       </w:r>
-      <w:bookmarkEnd w:id="53"/>
-      <w:bookmarkEnd w:id="54"/>
+      <w:bookmarkEnd w:id="57"/>
+      <w:bookmarkEnd w:id="58"/>
     </w:p>
     <w:p>
       <w:pPr>
@@ -18415,11 +18420,11 @@
       </w:r>
       <w:proofErr w:type="spellEnd"/>
       <w:r>
-        <w:t xml:space="preserve"> и устройствах с </w:t>
+        <w:t xml:space="preserve"> и устройствах с различными техническими характеристиками. В ходе тестирования особое внимание </w:t>
       </w:r>
       <w:r>
         <w:lastRenderedPageBreak/>
-        <w:t>различными техническими характеристиками. В ходе тестирования особое внимание уделяется стабильности работы приложения, отображению информации в реальном времени, а также корректности отображения новостей и статистики. Тестирование включает проверку навигации между экранами, функциональности отображения матчей, работы с профилями команд и игроков. Кроме того, проводится проверка отображения иконок и правильности работы кнопок нижней навигационной панели. Поскольку приложение ориентировано на оперативное предоставление спортивной информации, важной частью тестирования является проверка обновления данных о матчах и событиях. Все тест-кейсы выполняются последовательно, чтобы убедиться в отсутствии критических ошибок. На основе полученных данных производится приложения для обеспечения лучшего пользовательского опыта.</w:t>
+        <w:t>уделяется стабильности работы приложения, отображению информации в реальном времени, а также корректности отображения новостей и статистики. Тестирование включает проверку навигации между экранами, функциональности отображения матчей, работы с профилями команд и игроков. Кроме того, проводится проверка отображения иконок и правильности работы кнопок нижней навигационной панели. Поскольку приложение ориентировано на оперативное предоставление спортивной информации, важной частью тестирования является проверка обновления данных о матчах и событиях. Все тест-кейсы выполняются последовательно, чтобы убедиться в отсутствии критических ошибок. На основе полученных данных производится приложения для обеспечения лучшего пользовательского опыта.</w:t>
       </w:r>
     </w:p>
     <w:p>
@@ -19007,7 +19012,6 @@
         <w:ind w:firstLine="0"/>
       </w:pPr>
       <w:r>
-        <w:lastRenderedPageBreak/>
         <w:t xml:space="preserve">Продолжение таблицы </w:t>
       </w:r>
       <w:r>
@@ -19103,6 +19107,7 @@
               <w:jc w:val="center"/>
             </w:pPr>
             <w:r>
+              <w:lastRenderedPageBreak/>
               <w:t>№</w:t>
             </w:r>
           </w:p>
@@ -19714,7 +19719,6 @@
         <w:ind w:firstLine="0"/>
       </w:pPr>
       <w:r>
-        <w:lastRenderedPageBreak/>
         <w:t xml:space="preserve">Продолжение таблицы </w:t>
       </w:r>
       <w:r>
@@ -20003,6 +20007,7 @@
               <w:ind w:firstLine="39"/>
             </w:pPr>
             <w:r>
+              <w:lastRenderedPageBreak/>
               <w:t>5</w:t>
             </w:r>
           </w:p>
@@ -20139,26 +20144,26 @@
       <w:pPr>
         <w:pStyle w:val="110"/>
       </w:pPr>
-      <w:bookmarkStart w:id="55" w:name="_Toc193231739"/>
-      <w:bookmarkStart w:id="56" w:name="_Toc193271657"/>
+      <w:bookmarkStart w:id="59" w:name="_Toc193231739"/>
+      <w:bookmarkStart w:id="60" w:name="_Toc193271657"/>
       <w:r>
         <w:lastRenderedPageBreak/>
         <w:t>Применение</w:t>
       </w:r>
-      <w:bookmarkEnd w:id="55"/>
-      <w:bookmarkEnd w:id="56"/>
+      <w:bookmarkEnd w:id="59"/>
+      <w:bookmarkEnd w:id="60"/>
     </w:p>
     <w:p>
       <w:pPr>
         <w:pStyle w:val="220"/>
       </w:pPr>
-      <w:bookmarkStart w:id="57" w:name="_Toc193231740"/>
-      <w:bookmarkStart w:id="58" w:name="_Toc193271658"/>
+      <w:bookmarkStart w:id="61" w:name="_Toc193231740"/>
+      <w:bookmarkStart w:id="62" w:name="_Toc193271658"/>
       <w:r>
         <w:t>Общие сведения</w:t>
       </w:r>
-      <w:bookmarkEnd w:id="57"/>
-      <w:bookmarkEnd w:id="58"/>
+      <w:bookmarkEnd w:id="61"/>
+      <w:bookmarkEnd w:id="62"/>
     </w:p>
     <w:p>
       <w:pPr>
@@ -20266,11 +20271,24 @@
         <w:pStyle w:val="a5"/>
       </w:pPr>
       <w:r>
-        <w:t xml:space="preserve">Помимо технических аспектов, проект направлен на исследование UX/UI-дизайна, что помогает создать удобный, интуитивно понятный интерфейс, соответствующий современным стандартам мобильных приложений. Отдельное внимание уделяется адаптации приложения для </w:t>
-      </w:r>
+        <w:t>Помимо технических аспектов, проект направлен на исследование UX/UI-дизайна, что помогает создать удобный, интуитивно понятный интерфейс, соответствующий современным стандартам мобильных приложений. Отдельное внимание уделяется адаптации приложения для различных устройств, обеспечению его стабильности и высокой производительности.</w:t>
+      </w:r>
+    </w:p>
+    <w:p>
+      <w:pPr>
+        <w:pStyle w:val="a5"/>
+      </w:pPr>
       <w:r>
         <w:lastRenderedPageBreak/>
-        <w:t>различных устройств, обеспечению его стабильности и высокой производительности.</w:t>
+        <w:t xml:space="preserve">Кроме того, в рамках разработки рассматриваются вопросы безопасности данных пользователей, включая методы аутентификации и защиты личной информации. Проект способствует изучению технологий </w:t>
+      </w:r>
+      <w:proofErr w:type="spellStart"/>
+      <w:r>
+        <w:t>push</w:t>
+      </w:r>
+      <w:proofErr w:type="spellEnd"/>
+      <w:r>
+        <w:t>-уведомлений для своевременного информирования пользователей о новых новостях и спортивных событиях.</w:t>
       </w:r>
     </w:p>
     <w:p>
@@ -20278,22 +20296,6 @@
         <w:pStyle w:val="a5"/>
       </w:pPr>
       <w:r>
-        <w:t xml:space="preserve">Кроме того, в рамках разработки рассматриваются вопросы безопасности данных пользователей, включая методы аутентификации и защиты личной информации. Проект способствует изучению технологий </w:t>
-      </w:r>
-      <w:proofErr w:type="spellStart"/>
-      <w:r>
-        <w:t>push</w:t>
-      </w:r>
-      <w:proofErr w:type="spellEnd"/>
-      <w:r>
-        <w:t>-уведомлений для своевременного информирования пользователей о новых новостях и спортивных событиях.</w:t>
-      </w:r>
-    </w:p>
-    <w:p>
-      <w:pPr>
-        <w:pStyle w:val="a5"/>
-      </w:pPr>
-      <w:r>
         <w:t xml:space="preserve">Финальной целью является создание готового продукта, который будет полезен спортивным фанатам, предоставляя им возможность удобно и быстро получать актуальные новости, смотреть </w:t>
       </w:r>
       <w:r>
@@ -20307,13 +20309,13 @@
       <w:pPr>
         <w:pStyle w:val="230"/>
       </w:pPr>
-      <w:bookmarkStart w:id="59" w:name="_Toc193231741"/>
-      <w:bookmarkStart w:id="60" w:name="_Toc193271659"/>
+      <w:bookmarkStart w:id="63" w:name="_Toc193231741"/>
+      <w:bookmarkStart w:id="64" w:name="_Toc193271659"/>
       <w:r>
         <w:t>Назначение мобильного приложения</w:t>
       </w:r>
-      <w:bookmarkEnd w:id="59"/>
-      <w:bookmarkEnd w:id="60"/>
+      <w:bookmarkEnd w:id="63"/>
+      <w:bookmarkEnd w:id="64"/>
     </w:p>
     <w:p>
       <w:pPr>
@@ -21415,9 +21417,12 @@
       </w:r>
       <w:proofErr w:type="spellStart"/>
       <w:r>
-        <w:t>дБА.</w:t>
-      </w:r>
-      <w:proofErr w:type="spellEnd"/>
+        <w:t>дБА</w:t>
+      </w:r>
+      <w:proofErr w:type="spellEnd"/>
+      <w:r>
+        <w:t>.</w:t>
+      </w:r>
     </w:p>
     <w:p>
       <w:pPr>
@@ -22286,12 +22291,12 @@
       <w:r>
         <w:br w:type="page"/>
       </w:r>
-      <w:bookmarkStart w:id="61" w:name="_Toc196462050"/>
+      <w:bookmarkStart w:id="65" w:name="_Toc196462050"/>
       <w:r>
         <w:lastRenderedPageBreak/>
         <w:t>Экономический раздел</w:t>
       </w:r>
-      <w:bookmarkEnd w:id="61"/>
+      <w:bookmarkEnd w:id="65"/>
     </w:p>
     <w:p>
       <w:pPr>
@@ -22575,8 +22580,8 @@
         </w:rPr>
       </w:pPr>
     </w:p>
-    <w:bookmarkStart w:id="62" w:name="_Hlk153826073"/>
-    <w:bookmarkStart w:id="63" w:name="_Hlk153826177"/>
+    <w:bookmarkStart w:id="66" w:name="_Hlk153826073"/>
+    <w:bookmarkStart w:id="67" w:name="_Hlk153826177"/>
     <w:p>
       <w:pPr>
         <w:tabs>
@@ -22631,7 +22636,7 @@
             </m:r>
           </m:sub>
         </m:sSub>
-        <w:bookmarkEnd w:id="62"/>
+        <w:bookmarkEnd w:id="66"/>
         <m:r>
           <m:rPr>
             <m:sty m:val="p"/>
@@ -22685,7 +22690,7 @@
             </m:r>
           </m:sub>
         </m:sSub>
-        <w:bookmarkEnd w:id="63"/>
+        <w:bookmarkEnd w:id="67"/>
         <m:nary>
           <m:naryPr>
             <m:chr m:val="∑"/>
@@ -23153,10 +23158,10 @@
             <v:path o:extrusionok="f" gradientshapeok="t" o:connecttype="rect"/>
             <o:lock v:ext="edit" aspectratio="t"/>
           </v:shapetype>
-          <v:shape id="_x0000_i1037" type="#_x0000_t75" alt="" style="width:8pt;height:8pt;mso-width-percent:0;mso-height-percent:0;mso-width-percent:0;mso-height-percent:0" o:ole="">
+          <v:shape id="_x0000_i1025" type="#_x0000_t75" alt="" style="width:8pt;height:8pt;mso-width-percent:0;mso-height-percent:0;mso-width-percent:0;mso-height-percent:0" o:ole="">
             <v:imagedata r:id="rId17" o:title=""/>
           </v:shape>
-          <o:OLEObject Type="Embed" ProgID="Equation.3" ShapeID="_x0000_i1037" DrawAspect="Content" ObjectID="_1807288859" r:id="rId18"/>
+          <o:OLEObject Type="Embed" ProgID="Equation.3" ShapeID="_x0000_i1025" DrawAspect="Content" ObjectID="_1809033549" r:id="rId18"/>
         </w:object>
       </w:r>
       <w:r>
@@ -25233,7 +25238,7 @@
           </w:rPr>
           <m:t>=</m:t>
         </m:r>
-        <w:bookmarkStart w:id="64" w:name="_Hlk193384932"/>
+        <w:bookmarkStart w:id="68" w:name="_Hlk193384932"/>
         <m:r>
           <m:rPr>
             <m:sty m:val="p"/>
@@ -25245,7 +25250,7 @@
           </w:rPr>
           <m:t>23,</m:t>
         </m:r>
-        <w:bookmarkEnd w:id="64"/>
+        <w:bookmarkEnd w:id="68"/>
         <m:r>
           <m:rPr>
             <m:sty m:val="p"/>
@@ -25990,7 +25995,7 @@
           <w:highlight w:val="yellow"/>
         </w:rPr>
       </w:pPr>
-      <w:bookmarkStart w:id="65" w:name="_Hlk155199285"/>
+      <w:bookmarkStart w:id="69" w:name="_Hlk155199285"/>
     </w:p>
     <w:p>
       <w:pPr>
@@ -26428,7 +26433,7 @@
         <w:t xml:space="preserve"> руб.</w:t>
       </w:r>
     </w:p>
-    <w:bookmarkEnd w:id="65"/>
+    <w:bookmarkEnd w:id="69"/>
     <w:p>
       <w:pPr>
         <w:tabs>
@@ -26469,12 +26474,12 @@
         <w:pStyle w:val="230"/>
         <w:ind w:left="0" w:firstLine="709"/>
       </w:pPr>
-      <w:bookmarkStart w:id="66" w:name="_Toc98081088"/>
+      <w:bookmarkStart w:id="70" w:name="_Toc98081088"/>
       <w:r>
         <w:lastRenderedPageBreak/>
         <w:t>Расчет экономической эффективности у пользователя программного продукта</w:t>
       </w:r>
-      <w:bookmarkEnd w:id="66"/>
+      <w:bookmarkEnd w:id="70"/>
     </w:p>
     <w:p>
       <w:pPr>
@@ -27743,13 +27748,13 @@
         </w:numPr>
         <w:ind w:left="709"/>
       </w:pPr>
-      <w:bookmarkStart w:id="67" w:name="_Toc193231742"/>
-      <w:bookmarkStart w:id="68" w:name="_Toc193271660"/>
+      <w:bookmarkStart w:id="71" w:name="_Toc193231742"/>
+      <w:bookmarkStart w:id="72" w:name="_Toc193271660"/>
       <w:r>
         <w:t>Заключение</w:t>
       </w:r>
-      <w:bookmarkEnd w:id="67"/>
-      <w:bookmarkEnd w:id="68"/>
+      <w:bookmarkEnd w:id="71"/>
+      <w:bookmarkEnd w:id="72"/>
     </w:p>
     <w:p>
       <w:pPr>
@@ -27835,8 +27840,8 @@
         <w:pStyle w:val="11ehjdtym"/>
         <w:jc w:val="center"/>
       </w:pPr>
-      <w:bookmarkStart w:id="69" w:name="_Toc193231743"/>
-      <w:bookmarkStart w:id="70" w:name="_Toc193271661"/>
+      <w:bookmarkStart w:id="73" w:name="_Toc193231743"/>
+      <w:bookmarkStart w:id="74" w:name="_Toc193271661"/>
       <w:r>
         <w:lastRenderedPageBreak/>
         <w:t xml:space="preserve">Список </w:t>
@@ -27850,8 +27855,8 @@
       <w:r>
         <w:t>источников</w:t>
       </w:r>
-      <w:bookmarkEnd w:id="69"/>
-      <w:bookmarkEnd w:id="70"/>
+      <w:bookmarkEnd w:id="73"/>
+      <w:bookmarkEnd w:id="74"/>
     </w:p>
     <w:p>
       <w:pPr>
@@ -28262,12 +28267,12 @@
           <w:rFonts w:cs="Times New Roman"/>
         </w:rPr>
       </w:pPr>
-      <w:bookmarkStart w:id="71" w:name="_Toc188439684"/>
-      <w:bookmarkStart w:id="72" w:name="_Toc188439903"/>
-      <w:bookmarkStart w:id="73" w:name="_Toc188524949"/>
-      <w:bookmarkStart w:id="74" w:name="_Toc188620344"/>
-      <w:bookmarkStart w:id="75" w:name="_Toc193271662"/>
-      <w:bookmarkStart w:id="76" w:name="_Toc125050344"/>
+      <w:bookmarkStart w:id="75" w:name="_Toc188439684"/>
+      <w:bookmarkStart w:id="76" w:name="_Toc188439903"/>
+      <w:bookmarkStart w:id="77" w:name="_Toc188524949"/>
+      <w:bookmarkStart w:id="78" w:name="_Toc188620344"/>
+      <w:bookmarkStart w:id="79" w:name="_Toc193271662"/>
+      <w:bookmarkStart w:id="80" w:name="_Toc125050344"/>
       <w:r>
         <w:rPr>
           <w:rFonts w:cs="Times New Roman"/>
@@ -28275,13 +28280,13 @@
         <w:lastRenderedPageBreak/>
         <w:t>Приложение А</w:t>
       </w:r>
-      <w:bookmarkStart w:id="77" w:name="_Toc188439685"/>
-      <w:bookmarkStart w:id="78" w:name="_Toc188439904"/>
-      <w:bookmarkEnd w:id="71"/>
-      <w:bookmarkEnd w:id="72"/>
-      <w:bookmarkEnd w:id="73"/>
-      <w:bookmarkEnd w:id="74"/>
+      <w:bookmarkStart w:id="81" w:name="_Toc188439685"/>
+      <w:bookmarkStart w:id="82" w:name="_Toc188439904"/>
       <w:bookmarkEnd w:id="75"/>
+      <w:bookmarkEnd w:id="76"/>
+      <w:bookmarkEnd w:id="77"/>
+      <w:bookmarkEnd w:id="78"/>
+      <w:bookmarkEnd w:id="79"/>
     </w:p>
     <w:p>
       <w:pPr>
@@ -28298,18 +28303,18 @@
           <w:b w:val="0"/>
         </w:rPr>
       </w:pPr>
-      <w:bookmarkStart w:id="79" w:name="_Toc193271663"/>
+      <w:bookmarkStart w:id="83" w:name="_Toc193271663"/>
       <w:r>
         <w:rPr>
           <w:bCs/>
         </w:rPr>
         <w:t>(обязательное)</w:t>
       </w:r>
-      <w:bookmarkStart w:id="80" w:name="_Toc188439905"/>
-      <w:bookmarkStart w:id="81" w:name="_Toc188620345"/>
-      <w:bookmarkEnd w:id="77"/>
-      <w:bookmarkEnd w:id="78"/>
-      <w:bookmarkEnd w:id="79"/>
+      <w:bookmarkStart w:id="84" w:name="_Toc188439905"/>
+      <w:bookmarkStart w:id="85" w:name="_Toc188620345"/>
+      <w:bookmarkEnd w:id="81"/>
+      <w:bookmarkEnd w:id="82"/>
+      <w:bookmarkEnd w:id="83"/>
     </w:p>
     <w:p>
       <w:pPr>
@@ -28325,17 +28330,17 @@
           <w:rFonts w:cs="Times New Roman"/>
         </w:rPr>
       </w:pPr>
-      <w:bookmarkStart w:id="82" w:name="_Toc193271664"/>
+      <w:bookmarkStart w:id="86" w:name="_Toc193271664"/>
       <w:r>
         <w:rPr>
           <w:rFonts w:cs="Times New Roman"/>
         </w:rPr>
         <w:t>Текст программных модулей</w:t>
       </w:r>
-      <w:bookmarkEnd w:id="76"/>
       <w:bookmarkEnd w:id="80"/>
-      <w:bookmarkEnd w:id="81"/>
-      <w:bookmarkEnd w:id="82"/>
+      <w:bookmarkEnd w:id="84"/>
+      <w:bookmarkEnd w:id="85"/>
+      <w:bookmarkEnd w:id="86"/>
     </w:p>
     <w:p>
       <w:pPr>
@@ -45476,12 +45481,12 @@
           <w:szCs w:val="28"/>
         </w:rPr>
       </w:pPr>
-      <w:bookmarkStart w:id="83" w:name="_Toc188439687"/>
-      <w:bookmarkStart w:id="84" w:name="_Toc188439906"/>
-      <w:bookmarkStart w:id="85" w:name="_Toc188524951"/>
-      <w:bookmarkStart w:id="86" w:name="_Toc188620346"/>
-      <w:bookmarkStart w:id="87" w:name="_Toc193231744"/>
-      <w:bookmarkStart w:id="88" w:name="_Toc193271665"/>
+      <w:bookmarkStart w:id="87" w:name="_Toc188439687"/>
+      <w:bookmarkStart w:id="88" w:name="_Toc188439906"/>
+      <w:bookmarkStart w:id="89" w:name="_Toc188524951"/>
+      <w:bookmarkStart w:id="90" w:name="_Toc188620346"/>
+      <w:bookmarkStart w:id="91" w:name="_Toc193231744"/>
+      <w:bookmarkStart w:id="92" w:name="_Toc193271665"/>
       <w:r>
         <w:rPr>
           <w:rFonts w:cs="Times New Roman"/>
@@ -45490,12 +45495,12 @@
         <w:lastRenderedPageBreak/>
         <w:t>Приложение Б</w:t>
       </w:r>
-      <w:bookmarkEnd w:id="83"/>
-      <w:bookmarkEnd w:id="84"/>
-      <w:bookmarkEnd w:id="85"/>
-      <w:bookmarkEnd w:id="86"/>
       <w:bookmarkEnd w:id="87"/>
       <w:bookmarkEnd w:id="88"/>
+      <w:bookmarkEnd w:id="89"/>
+      <w:bookmarkEnd w:id="90"/>
+      <w:bookmarkEnd w:id="91"/>
+      <w:bookmarkEnd w:id="92"/>
     </w:p>
     <w:p>
       <w:pPr>
@@ -45509,8 +45514,8 @@
           <w:szCs w:val="28"/>
         </w:rPr>
       </w:pPr>
-      <w:bookmarkStart w:id="89" w:name="_Toc188439688"/>
-      <w:bookmarkStart w:id="90" w:name="_Toc188439907"/>
+      <w:bookmarkStart w:id="93" w:name="_Toc188439688"/>
+      <w:bookmarkStart w:id="94" w:name="_Toc188439907"/>
       <w:r>
         <w:rPr>
           <w:rFonts w:ascii="Times New Roman" w:hAnsi="Times New Roman" w:cs="Times New Roman"/>
@@ -45521,8 +45526,8 @@
         </w:rPr>
         <w:t>(справочное)</w:t>
       </w:r>
-      <w:bookmarkEnd w:id="89"/>
-      <w:bookmarkEnd w:id="90"/>
+      <w:bookmarkEnd w:id="93"/>
+      <w:bookmarkEnd w:id="94"/>
     </w:p>
     <w:p>
       <w:pPr>
@@ -45538,9 +45543,9 @@
           <w:szCs w:val="28"/>
         </w:rPr>
       </w:pPr>
-      <w:bookmarkStart w:id="91" w:name="_Toc188439908"/>
-      <w:bookmarkStart w:id="92" w:name="_Toc193231745"/>
-      <w:bookmarkStart w:id="93" w:name="_Toc193271666"/>
+      <w:bookmarkStart w:id="95" w:name="_Toc188439908"/>
+      <w:bookmarkStart w:id="96" w:name="_Toc193231745"/>
+      <w:bookmarkStart w:id="97" w:name="_Toc193271666"/>
       <w:r>
         <w:rPr>
           <w:rFonts w:cs="Times New Roman"/>
@@ -45548,9 +45553,9 @@
         </w:rPr>
         <w:t>Результаты работы программы</w:t>
       </w:r>
-      <w:bookmarkEnd w:id="91"/>
-      <w:bookmarkEnd w:id="92"/>
-      <w:bookmarkEnd w:id="93"/>
+      <w:bookmarkEnd w:id="95"/>
+      <w:bookmarkEnd w:id="96"/>
+      <w:bookmarkEnd w:id="97"/>
     </w:p>
     <w:p/>
     <w:p/>
@@ -48021,6 +48026,7 @@
   <w:style w:type="character" w:default="1" w:styleId="a0">
     <w:name w:val="Default Paragraph Font"/>
     <w:uiPriority w:val="1"/>
+    <w:semiHidden/>
     <w:unhideWhenUsed/>
   </w:style>
   <w:style w:type="table" w:default="1" w:styleId="a1">

</xml_diff>